<commit_message>
Make the TOC fully editable in Google Docs.
Use a three-column table of title, typed dots, and page number so font size and wording can be changed in the toolbar.

Co-authored-by: omkeluskar <omkeluskar@users.noreply.github.com>
</commit_message>
<xml_diff>
--- a/cep-iot-bus-stop/chapters/Table_of_Contents.docx
+++ b/cep-iot-bus-stop/chapters/Table_of_Contents.docx
@@ -4,7 +4,7 @@
   <w:body>
     <w:p>
       <w:pPr>
-        <w:spacing w:after="280"/>
+        <w:spacing w:after="320"/>
         <w:jc w:val="center"/>
       </w:pPr>
       <w:r>
@@ -16,25 +16,39 @@
         <w:t>TABLE OF CONTENTS</w:t>
       </w:r>
     </w:p>
+    <w:p>
+      <w:pPr>
+        <w:spacing w:after="200"/>
+        <w:jc w:val="center"/>
+      </w:pPr>
+      <w:r>
+        <w:rPr>
+          <w:rFonts w:ascii="Times New Roman" w:hAnsi="Times New Roman"/>
+          <w:b w:val="0"/>
+          <w:i/>
+          <w:sz w:val="20"/>
+        </w:rPr>
+        <w:t>Select all (Ctrl+A) then change Font / Font size in the toolbar. Edit any title or page number. Add or delete dots in the middle column.</w:t>
+      </w:r>
+    </w:p>
     <w:tbl>
       <w:tblPr>
         <w:tblW w:type="auto" w:w="0"/>
-        <w:tblLayout w:type="autofit"/>
         <w:tblLook w:firstColumn="1" w:firstRow="1" w:lastColumn="0" w:lastRow="0" w:noHBand="0" w:noVBand="1" w:val="04A0"/>
       </w:tblPr>
       <w:tblGrid>
-        <w:gridCol w:w="3289"/>
-        <w:gridCol w:w="3289"/>
-        <w:gridCol w:w="3289"/>
+        <w:gridCol w:w="3213"/>
+        <w:gridCol w:w="3213"/>
+        <w:gridCol w:w="3213"/>
       </w:tblGrid>
       <w:tr>
         <w:tc>
           <w:tcPr>
-            <w:tcW w:type="dxa" w:w="6236"/>
+            <w:tcW w:type="dxa" w:w="5386"/>
           </w:tcPr>
           <w:p>
             <w:pPr>
-              <w:spacing w:before="20" w:after="20"/>
+              <w:spacing w:before="40" w:after="40" w:line="276" w:lineRule="auto"/>
             </w:pPr>
             <w:r>
               <w:rPr>
@@ -48,24 +62,29 @@
         </w:tc>
         <w:tc>
           <w:tcPr>
-            <w:tcW w:type="dxa" w:w="2835"/>
-            <w:tcBorders>
-              <w:top w:val="nil"/>
-              <w:left w:val="nil"/>
-              <w:right w:val="nil"/>
-              <w:bottom w:val="dotted" w:sz="12" w:space="1" w:color="000000"/>
-            </w:tcBorders>
+            <w:tcW w:type="dxa" w:w="3118"/>
           </w:tcPr>
           <w:p>
-            <w:r/>
+            <w:pPr>
+              <w:spacing w:before="40" w:after="40"/>
+            </w:pPr>
+            <w:r>
+              <w:rPr>
+                <w:rFonts w:ascii="Times New Roman" w:hAnsi="Times New Roman"/>
+                <w:b w:val="0"/>
+                <w:sz w:val="24"/>
+              </w:rPr>
+              <w:t xml:space="preserve">. . . . . . . . . . . . . . . . </w:t>
+            </w:r>
           </w:p>
         </w:tc>
         <w:tc>
           <w:tcPr>
-            <w:tcW w:type="dxa" w:w="907"/>
+            <w:tcW w:type="dxa" w:w="1020"/>
           </w:tcPr>
           <w:p>
             <w:pPr>
+              <w:spacing w:before="40" w:after="40"/>
               <w:jc w:val="right"/>
             </w:pPr>
             <w:r>
@@ -82,11 +101,11 @@
       <w:tr>
         <w:tc>
           <w:tcPr>
-            <w:tcW w:type="dxa" w:w="6236"/>
+            <w:tcW w:type="dxa" w:w="5386"/>
           </w:tcPr>
           <w:p>
             <w:pPr>
-              <w:spacing w:before="20" w:after="20"/>
+              <w:spacing w:before="40" w:after="40" w:line="276" w:lineRule="auto"/>
               <w:ind w:left="283"/>
             </w:pPr>
             <w:r>
@@ -109,24 +128,29 @@
         </w:tc>
         <w:tc>
           <w:tcPr>
-            <w:tcW w:type="dxa" w:w="2835"/>
-            <w:tcBorders>
-              <w:top w:val="nil"/>
-              <w:left w:val="nil"/>
-              <w:right w:val="nil"/>
-              <w:bottom w:val="dotted" w:sz="12" w:space="1" w:color="000000"/>
-            </w:tcBorders>
+            <w:tcW w:type="dxa" w:w="3118"/>
           </w:tcPr>
           <w:p>
-            <w:r/>
+            <w:pPr>
+              <w:spacing w:before="40" w:after="40"/>
+            </w:pPr>
+            <w:r>
+              <w:rPr>
+                <w:rFonts w:ascii="Times New Roman" w:hAnsi="Times New Roman"/>
+                <w:b w:val="0"/>
+                <w:sz w:val="24"/>
+              </w:rPr>
+              <w:t xml:space="preserve">. . . . . . . . . . . . . . . . </w:t>
+            </w:r>
           </w:p>
         </w:tc>
         <w:tc>
           <w:tcPr>
-            <w:tcW w:type="dxa" w:w="907"/>
+            <w:tcW w:type="dxa" w:w="1020"/>
           </w:tcPr>
           <w:p>
             <w:pPr>
+              <w:spacing w:before="40" w:after="40"/>
               <w:jc w:val="right"/>
             </w:pPr>
             <w:r>
@@ -143,11 +167,11 @@
       <w:tr>
         <w:tc>
           <w:tcPr>
-            <w:tcW w:type="dxa" w:w="6236"/>
+            <w:tcW w:type="dxa" w:w="5386"/>
           </w:tcPr>
           <w:p>
             <w:pPr>
-              <w:spacing w:before="20" w:after="20"/>
+              <w:spacing w:before="40" w:after="40" w:line="276" w:lineRule="auto"/>
               <w:ind w:left="283"/>
             </w:pPr>
             <w:r>
@@ -170,24 +194,29 @@
         </w:tc>
         <w:tc>
           <w:tcPr>
-            <w:tcW w:type="dxa" w:w="2835"/>
-            <w:tcBorders>
-              <w:top w:val="nil"/>
-              <w:left w:val="nil"/>
-              <w:right w:val="nil"/>
-              <w:bottom w:val="dotted" w:sz="12" w:space="1" w:color="000000"/>
-            </w:tcBorders>
+            <w:tcW w:type="dxa" w:w="3118"/>
           </w:tcPr>
           <w:p>
-            <w:r/>
+            <w:pPr>
+              <w:spacing w:before="40" w:after="40"/>
+            </w:pPr>
+            <w:r>
+              <w:rPr>
+                <w:rFonts w:ascii="Times New Roman" w:hAnsi="Times New Roman"/>
+                <w:b w:val="0"/>
+                <w:sz w:val="24"/>
+              </w:rPr>
+              <w:t xml:space="preserve">. . . . . . . . . . . . . . . . </w:t>
+            </w:r>
           </w:p>
         </w:tc>
         <w:tc>
           <w:tcPr>
-            <w:tcW w:type="dxa" w:w="907"/>
+            <w:tcW w:type="dxa" w:w="1020"/>
           </w:tcPr>
           <w:p>
             <w:pPr>
+              <w:spacing w:before="40" w:after="40"/>
               <w:jc w:val="right"/>
             </w:pPr>
             <w:r>
@@ -204,11 +233,11 @@
       <w:tr>
         <w:tc>
           <w:tcPr>
-            <w:tcW w:type="dxa" w:w="6236"/>
+            <w:tcW w:type="dxa" w:w="5386"/>
           </w:tcPr>
           <w:p>
             <w:pPr>
-              <w:spacing w:before="20" w:after="20"/>
+              <w:spacing w:before="40" w:after="40" w:line="276" w:lineRule="auto"/>
               <w:ind w:left="283"/>
             </w:pPr>
             <w:r>
@@ -231,24 +260,29 @@
         </w:tc>
         <w:tc>
           <w:tcPr>
-            <w:tcW w:type="dxa" w:w="2835"/>
-            <w:tcBorders>
-              <w:top w:val="nil"/>
-              <w:left w:val="nil"/>
-              <w:right w:val="nil"/>
-              <w:bottom w:val="dotted" w:sz="12" w:space="1" w:color="000000"/>
-            </w:tcBorders>
+            <w:tcW w:type="dxa" w:w="3118"/>
           </w:tcPr>
           <w:p>
-            <w:r/>
+            <w:pPr>
+              <w:spacing w:before="40" w:after="40"/>
+            </w:pPr>
+            <w:r>
+              <w:rPr>
+                <w:rFonts w:ascii="Times New Roman" w:hAnsi="Times New Roman"/>
+                <w:b w:val="0"/>
+                <w:sz w:val="24"/>
+              </w:rPr>
+              <w:t xml:space="preserve">. . . . . . . . . . . . . . . . </w:t>
+            </w:r>
           </w:p>
         </w:tc>
         <w:tc>
           <w:tcPr>
-            <w:tcW w:type="dxa" w:w="907"/>
+            <w:tcW w:type="dxa" w:w="1020"/>
           </w:tcPr>
           <w:p>
             <w:pPr>
+              <w:spacing w:before="40" w:after="40"/>
               <w:jc w:val="right"/>
             </w:pPr>
             <w:r>
@@ -265,11 +299,11 @@
       <w:tr>
         <w:tc>
           <w:tcPr>
-            <w:tcW w:type="dxa" w:w="6236"/>
+            <w:tcW w:type="dxa" w:w="5386"/>
           </w:tcPr>
           <w:p>
             <w:pPr>
-              <w:spacing w:before="20" w:after="20"/>
+              <w:spacing w:before="40" w:after="40" w:line="276" w:lineRule="auto"/>
               <w:ind w:left="283"/>
             </w:pPr>
             <w:r>
@@ -292,24 +326,29 @@
         </w:tc>
         <w:tc>
           <w:tcPr>
-            <w:tcW w:type="dxa" w:w="2835"/>
-            <w:tcBorders>
-              <w:top w:val="nil"/>
-              <w:left w:val="nil"/>
-              <w:right w:val="nil"/>
-              <w:bottom w:val="dotted" w:sz="12" w:space="1" w:color="000000"/>
-            </w:tcBorders>
+            <w:tcW w:type="dxa" w:w="3118"/>
           </w:tcPr>
           <w:p>
-            <w:r/>
+            <w:pPr>
+              <w:spacing w:before="40" w:after="40"/>
+            </w:pPr>
+            <w:r>
+              <w:rPr>
+                <w:rFonts w:ascii="Times New Roman" w:hAnsi="Times New Roman"/>
+                <w:b w:val="0"/>
+                <w:sz w:val="24"/>
+              </w:rPr>
+              <w:t xml:space="preserve">. . . . . . . . . . . . . . . . </w:t>
+            </w:r>
           </w:p>
         </w:tc>
         <w:tc>
           <w:tcPr>
-            <w:tcW w:type="dxa" w:w="907"/>
+            <w:tcW w:type="dxa" w:w="1020"/>
           </w:tcPr>
           <w:p>
             <w:pPr>
+              <w:spacing w:before="40" w:after="40"/>
               <w:jc w:val="right"/>
             </w:pPr>
             <w:r>
@@ -326,11 +365,11 @@
       <w:tr>
         <w:tc>
           <w:tcPr>
-            <w:tcW w:type="dxa" w:w="6236"/>
+            <w:tcW w:type="dxa" w:w="5386"/>
           </w:tcPr>
           <w:p>
             <w:pPr>
-              <w:spacing w:before="20" w:after="20"/>
+              <w:spacing w:before="40" w:after="40" w:line="276" w:lineRule="auto"/>
               <w:ind w:left="283"/>
             </w:pPr>
             <w:r>
@@ -353,24 +392,29 @@
         </w:tc>
         <w:tc>
           <w:tcPr>
-            <w:tcW w:type="dxa" w:w="2835"/>
-            <w:tcBorders>
-              <w:top w:val="nil"/>
-              <w:left w:val="nil"/>
-              <w:right w:val="nil"/>
-              <w:bottom w:val="dotted" w:sz="12" w:space="1" w:color="000000"/>
-            </w:tcBorders>
+            <w:tcW w:type="dxa" w:w="3118"/>
           </w:tcPr>
           <w:p>
-            <w:r/>
+            <w:pPr>
+              <w:spacing w:before="40" w:after="40"/>
+            </w:pPr>
+            <w:r>
+              <w:rPr>
+                <w:rFonts w:ascii="Times New Roman" w:hAnsi="Times New Roman"/>
+                <w:b w:val="0"/>
+                <w:sz w:val="24"/>
+              </w:rPr>
+              <w:t xml:space="preserve">. . . . . . . . . . . . . . . . </w:t>
+            </w:r>
           </w:p>
         </w:tc>
         <w:tc>
           <w:tcPr>
-            <w:tcW w:type="dxa" w:w="907"/>
+            <w:tcW w:type="dxa" w:w="1020"/>
           </w:tcPr>
           <w:p>
             <w:pPr>
+              <w:spacing w:before="40" w:after="40"/>
               <w:jc w:val="right"/>
             </w:pPr>
             <w:r>
@@ -387,11 +431,11 @@
       <w:tr>
         <w:tc>
           <w:tcPr>
-            <w:tcW w:type="dxa" w:w="6236"/>
+            <w:tcW w:type="dxa" w:w="5386"/>
           </w:tcPr>
           <w:p>
             <w:pPr>
-              <w:spacing w:before="20" w:after="20"/>
+              <w:spacing w:before="40" w:after="40" w:line="276" w:lineRule="auto"/>
               <w:ind w:left="283"/>
             </w:pPr>
             <w:r>
@@ -414,24 +458,29 @@
         </w:tc>
         <w:tc>
           <w:tcPr>
-            <w:tcW w:type="dxa" w:w="2835"/>
-            <w:tcBorders>
-              <w:top w:val="nil"/>
-              <w:left w:val="nil"/>
-              <w:right w:val="nil"/>
-              <w:bottom w:val="dotted" w:sz="12" w:space="1" w:color="000000"/>
-            </w:tcBorders>
+            <w:tcW w:type="dxa" w:w="3118"/>
           </w:tcPr>
           <w:p>
-            <w:r/>
+            <w:pPr>
+              <w:spacing w:before="40" w:after="40"/>
+            </w:pPr>
+            <w:r>
+              <w:rPr>
+                <w:rFonts w:ascii="Times New Roman" w:hAnsi="Times New Roman"/>
+                <w:b w:val="0"/>
+                <w:sz w:val="24"/>
+              </w:rPr>
+              <w:t xml:space="preserve">. . . . . . . . . . . . . . . . </w:t>
+            </w:r>
           </w:p>
         </w:tc>
         <w:tc>
           <w:tcPr>
-            <w:tcW w:type="dxa" w:w="907"/>
+            <w:tcW w:type="dxa" w:w="1020"/>
           </w:tcPr>
           <w:p>
             <w:pPr>
+              <w:spacing w:before="40" w:after="40"/>
               <w:jc w:val="right"/>
             </w:pPr>
             <w:r>
@@ -448,11 +497,11 @@
       <w:tr>
         <w:tc>
           <w:tcPr>
-            <w:tcW w:type="dxa" w:w="6236"/>
+            <w:tcW w:type="dxa" w:w="5386"/>
           </w:tcPr>
           <w:p>
             <w:pPr>
-              <w:spacing w:before="20" w:after="20"/>
+              <w:spacing w:before="40" w:after="40" w:line="276" w:lineRule="auto"/>
               <w:ind w:left="283"/>
             </w:pPr>
             <w:r>
@@ -475,24 +524,29 @@
         </w:tc>
         <w:tc>
           <w:tcPr>
-            <w:tcW w:type="dxa" w:w="2835"/>
-            <w:tcBorders>
-              <w:top w:val="nil"/>
-              <w:left w:val="nil"/>
-              <w:right w:val="nil"/>
-              <w:bottom w:val="dotted" w:sz="12" w:space="1" w:color="000000"/>
-            </w:tcBorders>
+            <w:tcW w:type="dxa" w:w="3118"/>
           </w:tcPr>
           <w:p>
-            <w:r/>
+            <w:pPr>
+              <w:spacing w:before="40" w:after="40"/>
+            </w:pPr>
+            <w:r>
+              <w:rPr>
+                <w:rFonts w:ascii="Times New Roman" w:hAnsi="Times New Roman"/>
+                <w:b w:val="0"/>
+                <w:sz w:val="24"/>
+              </w:rPr>
+              <w:t xml:space="preserve">. . . . . . . . . . . . . . . . </w:t>
+            </w:r>
           </w:p>
         </w:tc>
         <w:tc>
           <w:tcPr>
-            <w:tcW w:type="dxa" w:w="907"/>
+            <w:tcW w:type="dxa" w:w="1020"/>
           </w:tcPr>
           <w:p>
             <w:pPr>
+              <w:spacing w:before="40" w:after="40"/>
               <w:jc w:val="right"/>
             </w:pPr>
             <w:r>
@@ -509,11 +563,11 @@
       <w:tr>
         <w:tc>
           <w:tcPr>
-            <w:tcW w:type="dxa" w:w="6236"/>
+            <w:tcW w:type="dxa" w:w="5386"/>
           </w:tcPr>
           <w:p>
             <w:pPr>
-              <w:spacing w:before="20" w:after="20"/>
+              <w:spacing w:before="40" w:after="40" w:line="276" w:lineRule="auto"/>
               <w:ind w:left="283"/>
             </w:pPr>
             <w:r>
@@ -536,24 +590,29 @@
         </w:tc>
         <w:tc>
           <w:tcPr>
-            <w:tcW w:type="dxa" w:w="2835"/>
-            <w:tcBorders>
-              <w:top w:val="nil"/>
-              <w:left w:val="nil"/>
-              <w:right w:val="nil"/>
-              <w:bottom w:val="dotted" w:sz="12" w:space="1" w:color="000000"/>
-            </w:tcBorders>
+            <w:tcW w:type="dxa" w:w="3118"/>
           </w:tcPr>
           <w:p>
-            <w:r/>
+            <w:pPr>
+              <w:spacing w:before="40" w:after="40"/>
+            </w:pPr>
+            <w:r>
+              <w:rPr>
+                <w:rFonts w:ascii="Times New Roman" w:hAnsi="Times New Roman"/>
+                <w:b w:val="0"/>
+                <w:sz w:val="24"/>
+              </w:rPr>
+              <w:t xml:space="preserve">. . . . . . . . . . . . . . . . </w:t>
+            </w:r>
           </w:p>
         </w:tc>
         <w:tc>
           <w:tcPr>
-            <w:tcW w:type="dxa" w:w="907"/>
+            <w:tcW w:type="dxa" w:w="1020"/>
           </w:tcPr>
           <w:p>
             <w:pPr>
+              <w:spacing w:before="40" w:after="40"/>
               <w:jc w:val="right"/>
             </w:pPr>
             <w:r>
@@ -570,11 +629,11 @@
       <w:tr>
         <w:tc>
           <w:tcPr>
-            <w:tcW w:type="dxa" w:w="6236"/>
+            <w:tcW w:type="dxa" w:w="5386"/>
           </w:tcPr>
           <w:p>
             <w:pPr>
-              <w:spacing w:before="20" w:after="20"/>
+              <w:spacing w:before="40" w:after="40" w:line="276" w:lineRule="auto"/>
               <w:ind w:left="283"/>
             </w:pPr>
             <w:r>
@@ -597,24 +656,29 @@
         </w:tc>
         <w:tc>
           <w:tcPr>
-            <w:tcW w:type="dxa" w:w="2835"/>
-            <w:tcBorders>
-              <w:top w:val="nil"/>
-              <w:left w:val="nil"/>
-              <w:right w:val="nil"/>
-              <w:bottom w:val="dotted" w:sz="12" w:space="1" w:color="000000"/>
-            </w:tcBorders>
+            <w:tcW w:type="dxa" w:w="3118"/>
           </w:tcPr>
           <w:p>
-            <w:r/>
+            <w:pPr>
+              <w:spacing w:before="40" w:after="40"/>
+            </w:pPr>
+            <w:r>
+              <w:rPr>
+                <w:rFonts w:ascii="Times New Roman" w:hAnsi="Times New Roman"/>
+                <w:b w:val="0"/>
+                <w:sz w:val="24"/>
+              </w:rPr>
+              <w:t xml:space="preserve">. . . . . . . . . . . . . . . . </w:t>
+            </w:r>
           </w:p>
         </w:tc>
         <w:tc>
           <w:tcPr>
-            <w:tcW w:type="dxa" w:w="907"/>
+            <w:tcW w:type="dxa" w:w="1020"/>
           </w:tcPr>
           <w:p>
             <w:pPr>
+              <w:spacing w:before="40" w:after="40"/>
               <w:jc w:val="right"/>
             </w:pPr>
             <w:r>
@@ -631,11 +695,11 @@
       <w:tr>
         <w:tc>
           <w:tcPr>
-            <w:tcW w:type="dxa" w:w="6236"/>
+            <w:tcW w:type="dxa" w:w="5386"/>
           </w:tcPr>
           <w:p>
             <w:pPr>
-              <w:spacing w:before="20" w:after="20"/>
+              <w:spacing w:before="40" w:after="40" w:line="276" w:lineRule="auto"/>
               <w:ind w:left="283"/>
             </w:pPr>
             <w:r>
@@ -658,24 +722,29 @@
         </w:tc>
         <w:tc>
           <w:tcPr>
-            <w:tcW w:type="dxa" w:w="2835"/>
-            <w:tcBorders>
-              <w:top w:val="nil"/>
-              <w:left w:val="nil"/>
-              <w:right w:val="nil"/>
-              <w:bottom w:val="dotted" w:sz="12" w:space="1" w:color="000000"/>
-            </w:tcBorders>
+            <w:tcW w:type="dxa" w:w="3118"/>
           </w:tcPr>
           <w:p>
-            <w:r/>
+            <w:pPr>
+              <w:spacing w:before="40" w:after="40"/>
+            </w:pPr>
+            <w:r>
+              <w:rPr>
+                <w:rFonts w:ascii="Times New Roman" w:hAnsi="Times New Roman"/>
+                <w:b w:val="0"/>
+                <w:sz w:val="24"/>
+              </w:rPr>
+              <w:t xml:space="preserve">. . . . . . . . . . . . . . . . </w:t>
+            </w:r>
           </w:p>
         </w:tc>
         <w:tc>
           <w:tcPr>
-            <w:tcW w:type="dxa" w:w="907"/>
+            <w:tcW w:type="dxa" w:w="1020"/>
           </w:tcPr>
           <w:p>
             <w:pPr>
+              <w:spacing w:before="40" w:after="40"/>
               <w:jc w:val="right"/>
             </w:pPr>
             <w:r>
@@ -692,11 +761,11 @@
       <w:tr>
         <w:tc>
           <w:tcPr>
-            <w:tcW w:type="dxa" w:w="6236"/>
+            <w:tcW w:type="dxa" w:w="5386"/>
           </w:tcPr>
           <w:p>
             <w:pPr>
-              <w:spacing w:before="20" w:after="20"/>
+              <w:spacing w:before="40" w:after="40" w:line="276" w:lineRule="auto"/>
               <w:ind w:left="283"/>
             </w:pPr>
             <w:r>
@@ -719,24 +788,29 @@
         </w:tc>
         <w:tc>
           <w:tcPr>
-            <w:tcW w:type="dxa" w:w="2835"/>
-            <w:tcBorders>
-              <w:top w:val="nil"/>
-              <w:left w:val="nil"/>
-              <w:right w:val="nil"/>
-              <w:bottom w:val="dotted" w:sz="12" w:space="1" w:color="000000"/>
-            </w:tcBorders>
+            <w:tcW w:type="dxa" w:w="3118"/>
           </w:tcPr>
           <w:p>
-            <w:r/>
+            <w:pPr>
+              <w:spacing w:before="40" w:after="40"/>
+            </w:pPr>
+            <w:r>
+              <w:rPr>
+                <w:rFonts w:ascii="Times New Roman" w:hAnsi="Times New Roman"/>
+                <w:b w:val="0"/>
+                <w:sz w:val="24"/>
+              </w:rPr>
+              <w:t xml:space="preserve">. . . . . . . . . . . . . . . . </w:t>
+            </w:r>
           </w:p>
         </w:tc>
         <w:tc>
           <w:tcPr>
-            <w:tcW w:type="dxa" w:w="907"/>
+            <w:tcW w:type="dxa" w:w="1020"/>
           </w:tcPr>
           <w:p>
             <w:pPr>
+              <w:spacing w:before="40" w:after="40"/>
               <w:jc w:val="right"/>
             </w:pPr>
             <w:r>
@@ -753,11 +827,11 @@
       <w:tr>
         <w:tc>
           <w:tcPr>
-            <w:tcW w:type="dxa" w:w="6236"/>
+            <w:tcW w:type="dxa" w:w="5386"/>
           </w:tcPr>
           <w:p>
             <w:pPr>
-              <w:spacing w:before="20" w:after="20"/>
+              <w:spacing w:before="40" w:after="40" w:line="276" w:lineRule="auto"/>
               <w:ind w:left="283"/>
             </w:pPr>
             <w:r>
@@ -780,24 +854,29 @@
         </w:tc>
         <w:tc>
           <w:tcPr>
-            <w:tcW w:type="dxa" w:w="2835"/>
-            <w:tcBorders>
-              <w:top w:val="nil"/>
-              <w:left w:val="nil"/>
-              <w:right w:val="nil"/>
-              <w:bottom w:val="dotted" w:sz="12" w:space="1" w:color="000000"/>
-            </w:tcBorders>
+            <w:tcW w:type="dxa" w:w="3118"/>
           </w:tcPr>
           <w:p>
-            <w:r/>
+            <w:pPr>
+              <w:spacing w:before="40" w:after="40"/>
+            </w:pPr>
+            <w:r>
+              <w:rPr>
+                <w:rFonts w:ascii="Times New Roman" w:hAnsi="Times New Roman"/>
+                <w:b w:val="0"/>
+                <w:sz w:val="24"/>
+              </w:rPr>
+              <w:t xml:space="preserve">. . . . . . . . . . . . . . . . </w:t>
+            </w:r>
           </w:p>
         </w:tc>
         <w:tc>
           <w:tcPr>
-            <w:tcW w:type="dxa" w:w="907"/>
+            <w:tcW w:type="dxa" w:w="1020"/>
           </w:tcPr>
           <w:p>
             <w:pPr>
+              <w:spacing w:before="40" w:after="40"/>
               <w:jc w:val="right"/>
             </w:pPr>
             <w:r>
@@ -814,11 +893,11 @@
       <w:tr>
         <w:tc>
           <w:tcPr>
-            <w:tcW w:type="dxa" w:w="6236"/>
+            <w:tcW w:type="dxa" w:w="5386"/>
           </w:tcPr>
           <w:p>
             <w:pPr>
-              <w:spacing w:before="20" w:after="20"/>
+              <w:spacing w:before="40" w:after="40" w:line="276" w:lineRule="auto"/>
               <w:ind w:left="283"/>
             </w:pPr>
             <w:r>
@@ -841,24 +920,29 @@
         </w:tc>
         <w:tc>
           <w:tcPr>
-            <w:tcW w:type="dxa" w:w="2835"/>
-            <w:tcBorders>
-              <w:top w:val="nil"/>
-              <w:left w:val="nil"/>
-              <w:right w:val="nil"/>
-              <w:bottom w:val="dotted" w:sz="12" w:space="1" w:color="000000"/>
-            </w:tcBorders>
+            <w:tcW w:type="dxa" w:w="3118"/>
           </w:tcPr>
           <w:p>
-            <w:r/>
+            <w:pPr>
+              <w:spacing w:before="40" w:after="40"/>
+            </w:pPr>
+            <w:r>
+              <w:rPr>
+                <w:rFonts w:ascii="Times New Roman" w:hAnsi="Times New Roman"/>
+                <w:b w:val="0"/>
+                <w:sz w:val="24"/>
+              </w:rPr>
+              <w:t xml:space="preserve">. . . . . . . . . . . . . . . . </w:t>
+            </w:r>
           </w:p>
         </w:tc>
         <w:tc>
           <w:tcPr>
-            <w:tcW w:type="dxa" w:w="907"/>
+            <w:tcW w:type="dxa" w:w="1020"/>
           </w:tcPr>
           <w:p>
             <w:pPr>
+              <w:spacing w:before="40" w:after="40"/>
               <w:jc w:val="right"/>
             </w:pPr>
             <w:r>
@@ -875,11 +959,11 @@
       <w:tr>
         <w:tc>
           <w:tcPr>
-            <w:tcW w:type="dxa" w:w="6236"/>
+            <w:tcW w:type="dxa" w:w="5386"/>
           </w:tcPr>
           <w:p>
             <w:pPr>
-              <w:spacing w:before="20" w:after="20"/>
+              <w:spacing w:before="40" w:after="40" w:line="276" w:lineRule="auto"/>
             </w:pPr>
             <w:r>
               <w:rPr>
@@ -893,24 +977,29 @@
         </w:tc>
         <w:tc>
           <w:tcPr>
-            <w:tcW w:type="dxa" w:w="2835"/>
-            <w:tcBorders>
-              <w:top w:val="nil"/>
-              <w:left w:val="nil"/>
-              <w:right w:val="nil"/>
-              <w:bottom w:val="dotted" w:sz="12" w:space="1" w:color="000000"/>
-            </w:tcBorders>
+            <w:tcW w:type="dxa" w:w="3118"/>
           </w:tcPr>
           <w:p>
-            <w:r/>
+            <w:pPr>
+              <w:spacing w:before="40" w:after="40"/>
+            </w:pPr>
+            <w:r>
+              <w:rPr>
+                <w:rFonts w:ascii="Times New Roman" w:hAnsi="Times New Roman"/>
+                <w:b w:val="0"/>
+                <w:sz w:val="24"/>
+              </w:rPr>
+              <w:t xml:space="preserve">. . . . . . . . . . . . . . . . </w:t>
+            </w:r>
           </w:p>
         </w:tc>
         <w:tc>
           <w:tcPr>
-            <w:tcW w:type="dxa" w:w="907"/>
+            <w:tcW w:type="dxa" w:w="1020"/>
           </w:tcPr>
           <w:p>
             <w:pPr>
+              <w:spacing w:before="40" w:after="40"/>
               <w:jc w:val="right"/>
             </w:pPr>
             <w:r>
@@ -927,11 +1016,11 @@
       <w:tr>
         <w:tc>
           <w:tcPr>
-            <w:tcW w:type="dxa" w:w="6236"/>
+            <w:tcW w:type="dxa" w:w="5386"/>
           </w:tcPr>
           <w:p>
             <w:pPr>
-              <w:spacing w:before="20" w:after="20"/>
+              <w:spacing w:before="40" w:after="40" w:line="276" w:lineRule="auto"/>
               <w:ind w:left="283"/>
             </w:pPr>
             <w:r>
@@ -954,24 +1043,29 @@
         </w:tc>
         <w:tc>
           <w:tcPr>
-            <w:tcW w:type="dxa" w:w="2835"/>
-            <w:tcBorders>
-              <w:top w:val="nil"/>
-              <w:left w:val="nil"/>
-              <w:right w:val="nil"/>
-              <w:bottom w:val="dotted" w:sz="12" w:space="1" w:color="000000"/>
-            </w:tcBorders>
+            <w:tcW w:type="dxa" w:w="3118"/>
           </w:tcPr>
           <w:p>
-            <w:r/>
+            <w:pPr>
+              <w:spacing w:before="40" w:after="40"/>
+            </w:pPr>
+            <w:r>
+              <w:rPr>
+                <w:rFonts w:ascii="Times New Roman" w:hAnsi="Times New Roman"/>
+                <w:b w:val="0"/>
+                <w:sz w:val="24"/>
+              </w:rPr>
+              <w:t xml:space="preserve">. . . . . . . . . . . . . . . . </w:t>
+            </w:r>
           </w:p>
         </w:tc>
         <w:tc>
           <w:tcPr>
-            <w:tcW w:type="dxa" w:w="907"/>
+            <w:tcW w:type="dxa" w:w="1020"/>
           </w:tcPr>
           <w:p>
             <w:pPr>
+              <w:spacing w:before="40" w:after="40"/>
               <w:jc w:val="right"/>
             </w:pPr>
             <w:r>
@@ -988,11 +1082,11 @@
       <w:tr>
         <w:tc>
           <w:tcPr>
-            <w:tcW w:type="dxa" w:w="6236"/>
+            <w:tcW w:type="dxa" w:w="5386"/>
           </w:tcPr>
           <w:p>
             <w:pPr>
-              <w:spacing w:before="20" w:after="20"/>
+              <w:spacing w:before="40" w:after="40" w:line="276" w:lineRule="auto"/>
               <w:ind w:left="283"/>
             </w:pPr>
             <w:r>
@@ -1015,24 +1109,29 @@
         </w:tc>
         <w:tc>
           <w:tcPr>
-            <w:tcW w:type="dxa" w:w="2835"/>
-            <w:tcBorders>
-              <w:top w:val="nil"/>
-              <w:left w:val="nil"/>
-              <w:right w:val="nil"/>
-              <w:bottom w:val="dotted" w:sz="12" w:space="1" w:color="000000"/>
-            </w:tcBorders>
+            <w:tcW w:type="dxa" w:w="3118"/>
           </w:tcPr>
           <w:p>
-            <w:r/>
+            <w:pPr>
+              <w:spacing w:before="40" w:after="40"/>
+            </w:pPr>
+            <w:r>
+              <w:rPr>
+                <w:rFonts w:ascii="Times New Roman" w:hAnsi="Times New Roman"/>
+                <w:b w:val="0"/>
+                <w:sz w:val="24"/>
+              </w:rPr>
+              <w:t xml:space="preserve">. . . . . . . . . . . . . . . . </w:t>
+            </w:r>
           </w:p>
         </w:tc>
         <w:tc>
           <w:tcPr>
-            <w:tcW w:type="dxa" w:w="907"/>
+            <w:tcW w:type="dxa" w:w="1020"/>
           </w:tcPr>
           <w:p>
             <w:pPr>
+              <w:spacing w:before="40" w:after="40"/>
               <w:jc w:val="right"/>
             </w:pPr>
             <w:r>
@@ -1049,11 +1148,11 @@
       <w:tr>
         <w:tc>
           <w:tcPr>
-            <w:tcW w:type="dxa" w:w="6236"/>
+            <w:tcW w:type="dxa" w:w="5386"/>
           </w:tcPr>
           <w:p>
             <w:pPr>
-              <w:spacing w:before="20" w:after="20"/>
+              <w:spacing w:before="40" w:after="40" w:line="276" w:lineRule="auto"/>
               <w:ind w:left="283"/>
             </w:pPr>
             <w:r>
@@ -1076,24 +1175,29 @@
         </w:tc>
         <w:tc>
           <w:tcPr>
-            <w:tcW w:type="dxa" w:w="2835"/>
-            <w:tcBorders>
-              <w:top w:val="nil"/>
-              <w:left w:val="nil"/>
-              <w:right w:val="nil"/>
-              <w:bottom w:val="dotted" w:sz="12" w:space="1" w:color="000000"/>
-            </w:tcBorders>
+            <w:tcW w:type="dxa" w:w="3118"/>
           </w:tcPr>
           <w:p>
-            <w:r/>
+            <w:pPr>
+              <w:spacing w:before="40" w:after="40"/>
+            </w:pPr>
+            <w:r>
+              <w:rPr>
+                <w:rFonts w:ascii="Times New Roman" w:hAnsi="Times New Roman"/>
+                <w:b w:val="0"/>
+                <w:sz w:val="24"/>
+              </w:rPr>
+              <w:t xml:space="preserve">. . . . . . . . . . . . . . . . </w:t>
+            </w:r>
           </w:p>
         </w:tc>
         <w:tc>
           <w:tcPr>
-            <w:tcW w:type="dxa" w:w="907"/>
+            <w:tcW w:type="dxa" w:w="1020"/>
           </w:tcPr>
           <w:p>
             <w:pPr>
+              <w:spacing w:before="40" w:after="40"/>
               <w:jc w:val="right"/>
             </w:pPr>
             <w:r>
@@ -1110,11 +1214,11 @@
       <w:tr>
         <w:tc>
           <w:tcPr>
-            <w:tcW w:type="dxa" w:w="6236"/>
+            <w:tcW w:type="dxa" w:w="5386"/>
           </w:tcPr>
           <w:p>
             <w:pPr>
-              <w:spacing w:before="20" w:after="20"/>
+              <w:spacing w:before="40" w:after="40" w:line="276" w:lineRule="auto"/>
               <w:ind w:left="283"/>
             </w:pPr>
             <w:r>
@@ -1137,24 +1241,29 @@
         </w:tc>
         <w:tc>
           <w:tcPr>
-            <w:tcW w:type="dxa" w:w="2835"/>
-            <w:tcBorders>
-              <w:top w:val="nil"/>
-              <w:left w:val="nil"/>
-              <w:right w:val="nil"/>
-              <w:bottom w:val="dotted" w:sz="12" w:space="1" w:color="000000"/>
-            </w:tcBorders>
+            <w:tcW w:type="dxa" w:w="3118"/>
           </w:tcPr>
           <w:p>
-            <w:r/>
+            <w:pPr>
+              <w:spacing w:before="40" w:after="40"/>
+            </w:pPr>
+            <w:r>
+              <w:rPr>
+                <w:rFonts w:ascii="Times New Roman" w:hAnsi="Times New Roman"/>
+                <w:b w:val="0"/>
+                <w:sz w:val="24"/>
+              </w:rPr>
+              <w:t xml:space="preserve">. . . . . . . . . . . . . . . . </w:t>
+            </w:r>
           </w:p>
         </w:tc>
         <w:tc>
           <w:tcPr>
-            <w:tcW w:type="dxa" w:w="907"/>
+            <w:tcW w:type="dxa" w:w="1020"/>
           </w:tcPr>
           <w:p>
             <w:pPr>
+              <w:spacing w:before="40" w:after="40"/>
               <w:jc w:val="right"/>
             </w:pPr>
             <w:r>
@@ -1171,11 +1280,11 @@
       <w:tr>
         <w:tc>
           <w:tcPr>
-            <w:tcW w:type="dxa" w:w="6236"/>
+            <w:tcW w:type="dxa" w:w="5386"/>
           </w:tcPr>
           <w:p>
             <w:pPr>
-              <w:spacing w:before="20" w:after="20"/>
+              <w:spacing w:before="40" w:after="40" w:line="276" w:lineRule="auto"/>
               <w:ind w:left="283"/>
             </w:pPr>
             <w:r>
@@ -1198,24 +1307,29 @@
         </w:tc>
         <w:tc>
           <w:tcPr>
-            <w:tcW w:type="dxa" w:w="2835"/>
-            <w:tcBorders>
-              <w:top w:val="nil"/>
-              <w:left w:val="nil"/>
-              <w:right w:val="nil"/>
-              <w:bottom w:val="dotted" w:sz="12" w:space="1" w:color="000000"/>
-            </w:tcBorders>
+            <w:tcW w:type="dxa" w:w="3118"/>
           </w:tcPr>
           <w:p>
-            <w:r/>
+            <w:pPr>
+              <w:spacing w:before="40" w:after="40"/>
+            </w:pPr>
+            <w:r>
+              <w:rPr>
+                <w:rFonts w:ascii="Times New Roman" w:hAnsi="Times New Roman"/>
+                <w:b w:val="0"/>
+                <w:sz w:val="24"/>
+              </w:rPr>
+              <w:t xml:space="preserve">. . . . . . . . . . . . . . . . </w:t>
+            </w:r>
           </w:p>
         </w:tc>
         <w:tc>
           <w:tcPr>
-            <w:tcW w:type="dxa" w:w="907"/>
+            <w:tcW w:type="dxa" w:w="1020"/>
           </w:tcPr>
           <w:p>
             <w:pPr>
+              <w:spacing w:before="40" w:after="40"/>
               <w:jc w:val="right"/>
             </w:pPr>
             <w:r>
@@ -1232,11 +1346,11 @@
       <w:tr>
         <w:tc>
           <w:tcPr>
-            <w:tcW w:type="dxa" w:w="6236"/>
+            <w:tcW w:type="dxa" w:w="5386"/>
           </w:tcPr>
           <w:p>
             <w:pPr>
-              <w:spacing w:before="20" w:after="20"/>
+              <w:spacing w:before="40" w:after="40" w:line="276" w:lineRule="auto"/>
               <w:ind w:left="283"/>
             </w:pPr>
             <w:r>
@@ -1259,24 +1373,29 @@
         </w:tc>
         <w:tc>
           <w:tcPr>
-            <w:tcW w:type="dxa" w:w="2835"/>
-            <w:tcBorders>
-              <w:top w:val="nil"/>
-              <w:left w:val="nil"/>
-              <w:right w:val="nil"/>
-              <w:bottom w:val="dotted" w:sz="12" w:space="1" w:color="000000"/>
-            </w:tcBorders>
+            <w:tcW w:type="dxa" w:w="3118"/>
           </w:tcPr>
           <w:p>
-            <w:r/>
+            <w:pPr>
+              <w:spacing w:before="40" w:after="40"/>
+            </w:pPr>
+            <w:r>
+              <w:rPr>
+                <w:rFonts w:ascii="Times New Roman" w:hAnsi="Times New Roman"/>
+                <w:b w:val="0"/>
+                <w:sz w:val="24"/>
+              </w:rPr>
+              <w:t xml:space="preserve">. . . . . . . . . . . . . . . . </w:t>
+            </w:r>
           </w:p>
         </w:tc>
         <w:tc>
           <w:tcPr>
-            <w:tcW w:type="dxa" w:w="907"/>
+            <w:tcW w:type="dxa" w:w="1020"/>
           </w:tcPr>
           <w:p>
             <w:pPr>
+              <w:spacing w:before="40" w:after="40"/>
               <w:jc w:val="right"/>
             </w:pPr>
             <w:r>
@@ -1293,11 +1412,11 @@
       <w:tr>
         <w:tc>
           <w:tcPr>
-            <w:tcW w:type="dxa" w:w="6236"/>
+            <w:tcW w:type="dxa" w:w="5386"/>
           </w:tcPr>
           <w:p>
             <w:pPr>
-              <w:spacing w:before="20" w:after="20"/>
+              <w:spacing w:before="40" w:after="40" w:line="276" w:lineRule="auto"/>
               <w:ind w:left="283"/>
             </w:pPr>
             <w:r>
@@ -1320,24 +1439,29 @@
         </w:tc>
         <w:tc>
           <w:tcPr>
-            <w:tcW w:type="dxa" w:w="2835"/>
-            <w:tcBorders>
-              <w:top w:val="nil"/>
-              <w:left w:val="nil"/>
-              <w:right w:val="nil"/>
-              <w:bottom w:val="dotted" w:sz="12" w:space="1" w:color="000000"/>
-            </w:tcBorders>
+            <w:tcW w:type="dxa" w:w="3118"/>
           </w:tcPr>
           <w:p>
-            <w:r/>
+            <w:pPr>
+              <w:spacing w:before="40" w:after="40"/>
+            </w:pPr>
+            <w:r>
+              <w:rPr>
+                <w:rFonts w:ascii="Times New Roman" w:hAnsi="Times New Roman"/>
+                <w:b w:val="0"/>
+                <w:sz w:val="24"/>
+              </w:rPr>
+              <w:t xml:space="preserve">. . . . . . . . . . . . . . . . </w:t>
+            </w:r>
           </w:p>
         </w:tc>
         <w:tc>
           <w:tcPr>
-            <w:tcW w:type="dxa" w:w="907"/>
+            <w:tcW w:type="dxa" w:w="1020"/>
           </w:tcPr>
           <w:p>
             <w:pPr>
+              <w:spacing w:before="40" w:after="40"/>
               <w:jc w:val="right"/>
             </w:pPr>
             <w:r>
@@ -1354,11 +1478,11 @@
       <w:tr>
         <w:tc>
           <w:tcPr>
-            <w:tcW w:type="dxa" w:w="6236"/>
+            <w:tcW w:type="dxa" w:w="5386"/>
           </w:tcPr>
           <w:p>
             <w:pPr>
-              <w:spacing w:before="20" w:after="20"/>
+              <w:spacing w:before="40" w:after="40" w:line="276" w:lineRule="auto"/>
               <w:ind w:left="283"/>
             </w:pPr>
             <w:r>
@@ -1381,24 +1505,29 @@
         </w:tc>
         <w:tc>
           <w:tcPr>
-            <w:tcW w:type="dxa" w:w="2835"/>
-            <w:tcBorders>
-              <w:top w:val="nil"/>
-              <w:left w:val="nil"/>
-              <w:right w:val="nil"/>
-              <w:bottom w:val="dotted" w:sz="12" w:space="1" w:color="000000"/>
-            </w:tcBorders>
+            <w:tcW w:type="dxa" w:w="3118"/>
           </w:tcPr>
           <w:p>
-            <w:r/>
+            <w:pPr>
+              <w:spacing w:before="40" w:after="40"/>
+            </w:pPr>
+            <w:r>
+              <w:rPr>
+                <w:rFonts w:ascii="Times New Roman" w:hAnsi="Times New Roman"/>
+                <w:b w:val="0"/>
+                <w:sz w:val="24"/>
+              </w:rPr>
+              <w:t xml:space="preserve">. . . . . . . . . . . . . . . . </w:t>
+            </w:r>
           </w:p>
         </w:tc>
         <w:tc>
           <w:tcPr>
-            <w:tcW w:type="dxa" w:w="907"/>
+            <w:tcW w:type="dxa" w:w="1020"/>
           </w:tcPr>
           <w:p>
             <w:pPr>
+              <w:spacing w:before="40" w:after="40"/>
               <w:jc w:val="right"/>
             </w:pPr>
             <w:r>
@@ -1415,11 +1544,11 @@
       <w:tr>
         <w:tc>
           <w:tcPr>
-            <w:tcW w:type="dxa" w:w="6236"/>
+            <w:tcW w:type="dxa" w:w="5386"/>
           </w:tcPr>
           <w:p>
             <w:pPr>
-              <w:spacing w:before="20" w:after="20"/>
+              <w:spacing w:before="40" w:after="40" w:line="276" w:lineRule="auto"/>
               <w:ind w:left="283"/>
             </w:pPr>
             <w:r>
@@ -1442,24 +1571,29 @@
         </w:tc>
         <w:tc>
           <w:tcPr>
-            <w:tcW w:type="dxa" w:w="2835"/>
-            <w:tcBorders>
-              <w:top w:val="nil"/>
-              <w:left w:val="nil"/>
-              <w:right w:val="nil"/>
-              <w:bottom w:val="dotted" w:sz="12" w:space="1" w:color="000000"/>
-            </w:tcBorders>
+            <w:tcW w:type="dxa" w:w="3118"/>
           </w:tcPr>
           <w:p>
-            <w:r/>
+            <w:pPr>
+              <w:spacing w:before="40" w:after="40"/>
+            </w:pPr>
+            <w:r>
+              <w:rPr>
+                <w:rFonts w:ascii="Times New Roman" w:hAnsi="Times New Roman"/>
+                <w:b w:val="0"/>
+                <w:sz w:val="24"/>
+              </w:rPr>
+              <w:t xml:space="preserve">. . . . . . . . . . . . . . . . </w:t>
+            </w:r>
           </w:p>
         </w:tc>
         <w:tc>
           <w:tcPr>
-            <w:tcW w:type="dxa" w:w="907"/>
+            <w:tcW w:type="dxa" w:w="1020"/>
           </w:tcPr>
           <w:p>
             <w:pPr>
+              <w:spacing w:before="40" w:after="40"/>
               <w:jc w:val="right"/>
             </w:pPr>
             <w:r>
@@ -1476,11 +1610,11 @@
       <w:tr>
         <w:tc>
           <w:tcPr>
-            <w:tcW w:type="dxa" w:w="6236"/>
+            <w:tcW w:type="dxa" w:w="5386"/>
           </w:tcPr>
           <w:p>
             <w:pPr>
-              <w:spacing w:before="20" w:after="20"/>
+              <w:spacing w:before="40" w:after="40" w:line="276" w:lineRule="auto"/>
               <w:ind w:left="283"/>
             </w:pPr>
             <w:r>
@@ -1503,24 +1637,29 @@
         </w:tc>
         <w:tc>
           <w:tcPr>
-            <w:tcW w:type="dxa" w:w="2835"/>
-            <w:tcBorders>
-              <w:top w:val="nil"/>
-              <w:left w:val="nil"/>
-              <w:right w:val="nil"/>
-              <w:bottom w:val="dotted" w:sz="12" w:space="1" w:color="000000"/>
-            </w:tcBorders>
+            <w:tcW w:type="dxa" w:w="3118"/>
           </w:tcPr>
           <w:p>
-            <w:r/>
+            <w:pPr>
+              <w:spacing w:before="40" w:after="40"/>
+            </w:pPr>
+            <w:r>
+              <w:rPr>
+                <w:rFonts w:ascii="Times New Roman" w:hAnsi="Times New Roman"/>
+                <w:b w:val="0"/>
+                <w:sz w:val="24"/>
+              </w:rPr>
+              <w:t xml:space="preserve">. . . . . . . . . . . . . . . . </w:t>
+            </w:r>
           </w:p>
         </w:tc>
         <w:tc>
           <w:tcPr>
-            <w:tcW w:type="dxa" w:w="907"/>
+            <w:tcW w:type="dxa" w:w="1020"/>
           </w:tcPr>
           <w:p>
             <w:pPr>
+              <w:spacing w:before="40" w:after="40"/>
               <w:jc w:val="right"/>
             </w:pPr>
             <w:r>
@@ -1537,11 +1676,11 @@
       <w:tr>
         <w:tc>
           <w:tcPr>
-            <w:tcW w:type="dxa" w:w="6236"/>
+            <w:tcW w:type="dxa" w:w="5386"/>
           </w:tcPr>
           <w:p>
             <w:pPr>
-              <w:spacing w:before="20" w:after="20"/>
+              <w:spacing w:before="40" w:after="40" w:line="276" w:lineRule="auto"/>
               <w:ind w:left="283"/>
             </w:pPr>
             <w:r>
@@ -1564,24 +1703,29 @@
         </w:tc>
         <w:tc>
           <w:tcPr>
-            <w:tcW w:type="dxa" w:w="2835"/>
-            <w:tcBorders>
-              <w:top w:val="nil"/>
-              <w:left w:val="nil"/>
-              <w:right w:val="nil"/>
-              <w:bottom w:val="dotted" w:sz="12" w:space="1" w:color="000000"/>
-            </w:tcBorders>
+            <w:tcW w:type="dxa" w:w="3118"/>
           </w:tcPr>
           <w:p>
-            <w:r/>
+            <w:pPr>
+              <w:spacing w:before="40" w:after="40"/>
+            </w:pPr>
+            <w:r>
+              <w:rPr>
+                <w:rFonts w:ascii="Times New Roman" w:hAnsi="Times New Roman"/>
+                <w:b w:val="0"/>
+                <w:sz w:val="24"/>
+              </w:rPr>
+              <w:t xml:space="preserve">. . . . . . . . . . . . . . . . </w:t>
+            </w:r>
           </w:p>
         </w:tc>
         <w:tc>
           <w:tcPr>
-            <w:tcW w:type="dxa" w:w="907"/>
+            <w:tcW w:type="dxa" w:w="1020"/>
           </w:tcPr>
           <w:p>
             <w:pPr>
+              <w:spacing w:before="40" w:after="40"/>
               <w:jc w:val="right"/>
             </w:pPr>
             <w:r>
@@ -1598,11 +1742,11 @@
       <w:tr>
         <w:tc>
           <w:tcPr>
-            <w:tcW w:type="dxa" w:w="6236"/>
+            <w:tcW w:type="dxa" w:w="5386"/>
           </w:tcPr>
           <w:p>
             <w:pPr>
-              <w:spacing w:before="20" w:after="20"/>
+              <w:spacing w:before="40" w:after="40" w:line="276" w:lineRule="auto"/>
               <w:ind w:left="283"/>
             </w:pPr>
             <w:r>
@@ -1625,24 +1769,29 @@
         </w:tc>
         <w:tc>
           <w:tcPr>
-            <w:tcW w:type="dxa" w:w="2835"/>
-            <w:tcBorders>
-              <w:top w:val="nil"/>
-              <w:left w:val="nil"/>
-              <w:right w:val="nil"/>
-              <w:bottom w:val="dotted" w:sz="12" w:space="1" w:color="000000"/>
-            </w:tcBorders>
+            <w:tcW w:type="dxa" w:w="3118"/>
           </w:tcPr>
           <w:p>
-            <w:r/>
+            <w:pPr>
+              <w:spacing w:before="40" w:after="40"/>
+            </w:pPr>
+            <w:r>
+              <w:rPr>
+                <w:rFonts w:ascii="Times New Roman" w:hAnsi="Times New Roman"/>
+                <w:b w:val="0"/>
+                <w:sz w:val="24"/>
+              </w:rPr>
+              <w:t xml:space="preserve">. . . . . . . . . . . . . . . . </w:t>
+            </w:r>
           </w:p>
         </w:tc>
         <w:tc>
           <w:tcPr>
-            <w:tcW w:type="dxa" w:w="907"/>
+            <w:tcW w:type="dxa" w:w="1020"/>
           </w:tcPr>
           <w:p>
             <w:pPr>
+              <w:spacing w:before="40" w:after="40"/>
               <w:jc w:val="right"/>
             </w:pPr>
             <w:r>
@@ -1659,11 +1808,11 @@
       <w:tr>
         <w:tc>
           <w:tcPr>
-            <w:tcW w:type="dxa" w:w="6236"/>
+            <w:tcW w:type="dxa" w:w="5386"/>
           </w:tcPr>
           <w:p>
             <w:pPr>
-              <w:spacing w:before="20" w:after="20"/>
+              <w:spacing w:before="40" w:after="40" w:line="276" w:lineRule="auto"/>
               <w:ind w:left="283"/>
             </w:pPr>
             <w:r>
@@ -1686,24 +1835,29 @@
         </w:tc>
         <w:tc>
           <w:tcPr>
-            <w:tcW w:type="dxa" w:w="2835"/>
-            <w:tcBorders>
-              <w:top w:val="nil"/>
-              <w:left w:val="nil"/>
-              <w:right w:val="nil"/>
-              <w:bottom w:val="dotted" w:sz="12" w:space="1" w:color="000000"/>
-            </w:tcBorders>
+            <w:tcW w:type="dxa" w:w="3118"/>
           </w:tcPr>
           <w:p>
-            <w:r/>
+            <w:pPr>
+              <w:spacing w:before="40" w:after="40"/>
+            </w:pPr>
+            <w:r>
+              <w:rPr>
+                <w:rFonts w:ascii="Times New Roman" w:hAnsi="Times New Roman"/>
+                <w:b w:val="0"/>
+                <w:sz w:val="24"/>
+              </w:rPr>
+              <w:t xml:space="preserve">. . . . . . . . . . . . . . . . </w:t>
+            </w:r>
           </w:p>
         </w:tc>
         <w:tc>
           <w:tcPr>
-            <w:tcW w:type="dxa" w:w="907"/>
+            <w:tcW w:type="dxa" w:w="1020"/>
           </w:tcPr>
           <w:p>
             <w:pPr>
+              <w:spacing w:before="40" w:after="40"/>
               <w:jc w:val="right"/>
             </w:pPr>
             <w:r>
@@ -1720,11 +1874,11 @@
       <w:tr>
         <w:tc>
           <w:tcPr>
-            <w:tcW w:type="dxa" w:w="6236"/>
+            <w:tcW w:type="dxa" w:w="5386"/>
           </w:tcPr>
           <w:p>
             <w:pPr>
-              <w:spacing w:before="20" w:after="20"/>
+              <w:spacing w:before="40" w:after="40" w:line="276" w:lineRule="auto"/>
             </w:pPr>
             <w:r>
               <w:rPr>
@@ -1738,24 +1892,29 @@
         </w:tc>
         <w:tc>
           <w:tcPr>
-            <w:tcW w:type="dxa" w:w="2835"/>
-            <w:tcBorders>
-              <w:top w:val="nil"/>
-              <w:left w:val="nil"/>
-              <w:right w:val="nil"/>
-              <w:bottom w:val="dotted" w:sz="12" w:space="1" w:color="000000"/>
-            </w:tcBorders>
+            <w:tcW w:type="dxa" w:w="3118"/>
           </w:tcPr>
           <w:p>
-            <w:r/>
+            <w:pPr>
+              <w:spacing w:before="40" w:after="40"/>
+            </w:pPr>
+            <w:r>
+              <w:rPr>
+                <w:rFonts w:ascii="Times New Roman" w:hAnsi="Times New Roman"/>
+                <w:b w:val="0"/>
+                <w:sz w:val="24"/>
+              </w:rPr>
+              <w:t xml:space="preserve">. . . . . . . . . . . . . . . . </w:t>
+            </w:r>
           </w:p>
         </w:tc>
         <w:tc>
           <w:tcPr>
-            <w:tcW w:type="dxa" w:w="907"/>
+            <w:tcW w:type="dxa" w:w="1020"/>
           </w:tcPr>
           <w:p>
             <w:pPr>
+              <w:spacing w:before="40" w:after="40"/>
               <w:jc w:val="right"/>
             </w:pPr>
             <w:r>
@@ -1772,11 +1931,11 @@
       <w:tr>
         <w:tc>
           <w:tcPr>
-            <w:tcW w:type="dxa" w:w="6236"/>
+            <w:tcW w:type="dxa" w:w="5386"/>
           </w:tcPr>
           <w:p>
             <w:pPr>
-              <w:spacing w:before="20" w:after="20"/>
+              <w:spacing w:before="40" w:after="40" w:line="276" w:lineRule="auto"/>
               <w:ind w:left="283"/>
             </w:pPr>
             <w:r>
@@ -1799,24 +1958,29 @@
         </w:tc>
         <w:tc>
           <w:tcPr>
-            <w:tcW w:type="dxa" w:w="2835"/>
-            <w:tcBorders>
-              <w:top w:val="nil"/>
-              <w:left w:val="nil"/>
-              <w:right w:val="nil"/>
-              <w:bottom w:val="dotted" w:sz="12" w:space="1" w:color="000000"/>
-            </w:tcBorders>
+            <w:tcW w:type="dxa" w:w="3118"/>
           </w:tcPr>
           <w:p>
-            <w:r/>
+            <w:pPr>
+              <w:spacing w:before="40" w:after="40"/>
+            </w:pPr>
+            <w:r>
+              <w:rPr>
+                <w:rFonts w:ascii="Times New Roman" w:hAnsi="Times New Roman"/>
+                <w:b w:val="0"/>
+                <w:sz w:val="24"/>
+              </w:rPr>
+              <w:t xml:space="preserve">. . . . . . . . . . . . . . . . </w:t>
+            </w:r>
           </w:p>
         </w:tc>
         <w:tc>
           <w:tcPr>
-            <w:tcW w:type="dxa" w:w="907"/>
+            <w:tcW w:type="dxa" w:w="1020"/>
           </w:tcPr>
           <w:p>
             <w:pPr>
+              <w:spacing w:before="40" w:after="40"/>
               <w:jc w:val="right"/>
             </w:pPr>
             <w:r>
@@ -1833,11 +1997,11 @@
       <w:tr>
         <w:tc>
           <w:tcPr>
-            <w:tcW w:type="dxa" w:w="6236"/>
+            <w:tcW w:type="dxa" w:w="5386"/>
           </w:tcPr>
           <w:p>
             <w:pPr>
-              <w:spacing w:before="20" w:after="20"/>
+              <w:spacing w:before="40" w:after="40" w:line="276" w:lineRule="auto"/>
               <w:ind w:left="283"/>
             </w:pPr>
             <w:r>
@@ -1860,24 +2024,29 @@
         </w:tc>
         <w:tc>
           <w:tcPr>
-            <w:tcW w:type="dxa" w:w="2835"/>
-            <w:tcBorders>
-              <w:top w:val="nil"/>
-              <w:left w:val="nil"/>
-              <w:right w:val="nil"/>
-              <w:bottom w:val="dotted" w:sz="12" w:space="1" w:color="000000"/>
-            </w:tcBorders>
+            <w:tcW w:type="dxa" w:w="3118"/>
           </w:tcPr>
           <w:p>
-            <w:r/>
+            <w:pPr>
+              <w:spacing w:before="40" w:after="40"/>
+            </w:pPr>
+            <w:r>
+              <w:rPr>
+                <w:rFonts w:ascii="Times New Roman" w:hAnsi="Times New Roman"/>
+                <w:b w:val="0"/>
+                <w:sz w:val="24"/>
+              </w:rPr>
+              <w:t xml:space="preserve">. . . . . . . . . . . . . . . . </w:t>
+            </w:r>
           </w:p>
         </w:tc>
         <w:tc>
           <w:tcPr>
-            <w:tcW w:type="dxa" w:w="907"/>
+            <w:tcW w:type="dxa" w:w="1020"/>
           </w:tcPr>
           <w:p>
             <w:pPr>
+              <w:spacing w:before="40" w:after="40"/>
               <w:jc w:val="right"/>
             </w:pPr>
             <w:r>
@@ -1894,11 +2063,11 @@
       <w:tr>
         <w:tc>
           <w:tcPr>
-            <w:tcW w:type="dxa" w:w="6236"/>
+            <w:tcW w:type="dxa" w:w="5386"/>
           </w:tcPr>
           <w:p>
             <w:pPr>
-              <w:spacing w:before="20" w:after="20"/>
+              <w:spacing w:before="40" w:after="40" w:line="276" w:lineRule="auto"/>
               <w:ind w:left="283"/>
             </w:pPr>
             <w:r>
@@ -1921,24 +2090,29 @@
         </w:tc>
         <w:tc>
           <w:tcPr>
-            <w:tcW w:type="dxa" w:w="2835"/>
-            <w:tcBorders>
-              <w:top w:val="nil"/>
-              <w:left w:val="nil"/>
-              <w:right w:val="nil"/>
-              <w:bottom w:val="dotted" w:sz="12" w:space="1" w:color="000000"/>
-            </w:tcBorders>
+            <w:tcW w:type="dxa" w:w="3118"/>
           </w:tcPr>
           <w:p>
-            <w:r/>
+            <w:pPr>
+              <w:spacing w:before="40" w:after="40"/>
+            </w:pPr>
+            <w:r>
+              <w:rPr>
+                <w:rFonts w:ascii="Times New Roman" w:hAnsi="Times New Roman"/>
+                <w:b w:val="0"/>
+                <w:sz w:val="24"/>
+              </w:rPr>
+              <w:t xml:space="preserve">. . . . . . . . . . . . . . . . </w:t>
+            </w:r>
           </w:p>
         </w:tc>
         <w:tc>
           <w:tcPr>
-            <w:tcW w:type="dxa" w:w="907"/>
+            <w:tcW w:type="dxa" w:w="1020"/>
           </w:tcPr>
           <w:p>
             <w:pPr>
+              <w:spacing w:before="40" w:after="40"/>
               <w:jc w:val="right"/>
             </w:pPr>
             <w:r>
@@ -1955,11 +2129,11 @@
       <w:tr>
         <w:tc>
           <w:tcPr>
-            <w:tcW w:type="dxa" w:w="6236"/>
+            <w:tcW w:type="dxa" w:w="5386"/>
           </w:tcPr>
           <w:p>
             <w:pPr>
-              <w:spacing w:before="20" w:after="20"/>
+              <w:spacing w:before="40" w:after="40" w:line="276" w:lineRule="auto"/>
               <w:ind w:left="283"/>
             </w:pPr>
             <w:r>
@@ -1982,24 +2156,29 @@
         </w:tc>
         <w:tc>
           <w:tcPr>
-            <w:tcW w:type="dxa" w:w="2835"/>
-            <w:tcBorders>
-              <w:top w:val="nil"/>
-              <w:left w:val="nil"/>
-              <w:right w:val="nil"/>
-              <w:bottom w:val="dotted" w:sz="12" w:space="1" w:color="000000"/>
-            </w:tcBorders>
+            <w:tcW w:type="dxa" w:w="3118"/>
           </w:tcPr>
           <w:p>
-            <w:r/>
+            <w:pPr>
+              <w:spacing w:before="40" w:after="40"/>
+            </w:pPr>
+            <w:r>
+              <w:rPr>
+                <w:rFonts w:ascii="Times New Roman" w:hAnsi="Times New Roman"/>
+                <w:b w:val="0"/>
+                <w:sz w:val="24"/>
+              </w:rPr>
+              <w:t xml:space="preserve">. . . . . . . . . . . . . . . . </w:t>
+            </w:r>
           </w:p>
         </w:tc>
         <w:tc>
           <w:tcPr>
-            <w:tcW w:type="dxa" w:w="907"/>
+            <w:tcW w:type="dxa" w:w="1020"/>
           </w:tcPr>
           <w:p>
             <w:pPr>
+              <w:spacing w:before="40" w:after="40"/>
               <w:jc w:val="right"/>
             </w:pPr>
             <w:r>
@@ -2016,11 +2195,11 @@
       <w:tr>
         <w:tc>
           <w:tcPr>
-            <w:tcW w:type="dxa" w:w="6236"/>
+            <w:tcW w:type="dxa" w:w="5386"/>
           </w:tcPr>
           <w:p>
             <w:pPr>
-              <w:spacing w:before="20" w:after="20"/>
+              <w:spacing w:before="40" w:after="40" w:line="276" w:lineRule="auto"/>
               <w:ind w:left="283"/>
             </w:pPr>
             <w:r>
@@ -2043,24 +2222,29 @@
         </w:tc>
         <w:tc>
           <w:tcPr>
-            <w:tcW w:type="dxa" w:w="2835"/>
-            <w:tcBorders>
-              <w:top w:val="nil"/>
-              <w:left w:val="nil"/>
-              <w:right w:val="nil"/>
-              <w:bottom w:val="dotted" w:sz="12" w:space="1" w:color="000000"/>
-            </w:tcBorders>
+            <w:tcW w:type="dxa" w:w="3118"/>
           </w:tcPr>
           <w:p>
-            <w:r/>
+            <w:pPr>
+              <w:spacing w:before="40" w:after="40"/>
+            </w:pPr>
+            <w:r>
+              <w:rPr>
+                <w:rFonts w:ascii="Times New Roman" w:hAnsi="Times New Roman"/>
+                <w:b w:val="0"/>
+                <w:sz w:val="24"/>
+              </w:rPr>
+              <w:t xml:space="preserve">. . . . . . . . . . . . . . . . </w:t>
+            </w:r>
           </w:p>
         </w:tc>
         <w:tc>
           <w:tcPr>
-            <w:tcW w:type="dxa" w:w="907"/>
+            <w:tcW w:type="dxa" w:w="1020"/>
           </w:tcPr>
           <w:p>
             <w:pPr>
+              <w:spacing w:before="40" w:after="40"/>
               <w:jc w:val="right"/>
             </w:pPr>
             <w:r>
@@ -2077,11 +2261,11 @@
       <w:tr>
         <w:tc>
           <w:tcPr>
-            <w:tcW w:type="dxa" w:w="6236"/>
+            <w:tcW w:type="dxa" w:w="5386"/>
           </w:tcPr>
           <w:p>
             <w:pPr>
-              <w:spacing w:before="20" w:after="20"/>
+              <w:spacing w:before="40" w:after="40" w:line="276" w:lineRule="auto"/>
               <w:ind w:left="283"/>
             </w:pPr>
             <w:r>
@@ -2104,24 +2288,29 @@
         </w:tc>
         <w:tc>
           <w:tcPr>
-            <w:tcW w:type="dxa" w:w="2835"/>
-            <w:tcBorders>
-              <w:top w:val="nil"/>
-              <w:left w:val="nil"/>
-              <w:right w:val="nil"/>
-              <w:bottom w:val="dotted" w:sz="12" w:space="1" w:color="000000"/>
-            </w:tcBorders>
+            <w:tcW w:type="dxa" w:w="3118"/>
           </w:tcPr>
           <w:p>
-            <w:r/>
+            <w:pPr>
+              <w:spacing w:before="40" w:after="40"/>
+            </w:pPr>
+            <w:r>
+              <w:rPr>
+                <w:rFonts w:ascii="Times New Roman" w:hAnsi="Times New Roman"/>
+                <w:b w:val="0"/>
+                <w:sz w:val="24"/>
+              </w:rPr>
+              <w:t xml:space="preserve">. . . . . . . . . . . . . . . . </w:t>
+            </w:r>
           </w:p>
         </w:tc>
         <w:tc>
           <w:tcPr>
-            <w:tcW w:type="dxa" w:w="907"/>
+            <w:tcW w:type="dxa" w:w="1020"/>
           </w:tcPr>
           <w:p>
             <w:pPr>
+              <w:spacing w:before="40" w:after="40"/>
               <w:jc w:val="right"/>
             </w:pPr>
             <w:r>
@@ -2138,11 +2327,11 @@
       <w:tr>
         <w:tc>
           <w:tcPr>
-            <w:tcW w:type="dxa" w:w="6236"/>
+            <w:tcW w:type="dxa" w:w="5386"/>
           </w:tcPr>
           <w:p>
             <w:pPr>
-              <w:spacing w:before="20" w:after="20"/>
+              <w:spacing w:before="40" w:after="40" w:line="276" w:lineRule="auto"/>
               <w:ind w:left="283"/>
             </w:pPr>
             <w:r>
@@ -2165,24 +2354,29 @@
         </w:tc>
         <w:tc>
           <w:tcPr>
-            <w:tcW w:type="dxa" w:w="2835"/>
-            <w:tcBorders>
-              <w:top w:val="nil"/>
-              <w:left w:val="nil"/>
-              <w:right w:val="nil"/>
-              <w:bottom w:val="dotted" w:sz="12" w:space="1" w:color="000000"/>
-            </w:tcBorders>
+            <w:tcW w:type="dxa" w:w="3118"/>
           </w:tcPr>
           <w:p>
-            <w:r/>
+            <w:pPr>
+              <w:spacing w:before="40" w:after="40"/>
+            </w:pPr>
+            <w:r>
+              <w:rPr>
+                <w:rFonts w:ascii="Times New Roman" w:hAnsi="Times New Roman"/>
+                <w:b w:val="0"/>
+                <w:sz w:val="24"/>
+              </w:rPr>
+              <w:t xml:space="preserve">. . . . . . . . . . . . . . . . </w:t>
+            </w:r>
           </w:p>
         </w:tc>
         <w:tc>
           <w:tcPr>
-            <w:tcW w:type="dxa" w:w="907"/>
+            <w:tcW w:type="dxa" w:w="1020"/>
           </w:tcPr>
           <w:p>
             <w:pPr>
+              <w:spacing w:before="40" w:after="40"/>
               <w:jc w:val="right"/>
             </w:pPr>
             <w:r>
@@ -2199,11 +2393,11 @@
       <w:tr>
         <w:tc>
           <w:tcPr>
-            <w:tcW w:type="dxa" w:w="6236"/>
+            <w:tcW w:type="dxa" w:w="5386"/>
           </w:tcPr>
           <w:p>
             <w:pPr>
-              <w:spacing w:before="20" w:after="20"/>
+              <w:spacing w:before="40" w:after="40" w:line="276" w:lineRule="auto"/>
               <w:ind w:left="283"/>
             </w:pPr>
             <w:r>
@@ -2226,24 +2420,29 @@
         </w:tc>
         <w:tc>
           <w:tcPr>
-            <w:tcW w:type="dxa" w:w="2835"/>
-            <w:tcBorders>
-              <w:top w:val="nil"/>
-              <w:left w:val="nil"/>
-              <w:right w:val="nil"/>
-              <w:bottom w:val="dotted" w:sz="12" w:space="1" w:color="000000"/>
-            </w:tcBorders>
+            <w:tcW w:type="dxa" w:w="3118"/>
           </w:tcPr>
           <w:p>
-            <w:r/>
+            <w:pPr>
+              <w:spacing w:before="40" w:after="40"/>
+            </w:pPr>
+            <w:r>
+              <w:rPr>
+                <w:rFonts w:ascii="Times New Roman" w:hAnsi="Times New Roman"/>
+                <w:b w:val="0"/>
+                <w:sz w:val="24"/>
+              </w:rPr>
+              <w:t xml:space="preserve">. . . . . . . . . . . . . . . . </w:t>
+            </w:r>
           </w:p>
         </w:tc>
         <w:tc>
           <w:tcPr>
-            <w:tcW w:type="dxa" w:w="907"/>
+            <w:tcW w:type="dxa" w:w="1020"/>
           </w:tcPr>
           <w:p>
             <w:pPr>
+              <w:spacing w:before="40" w:after="40"/>
               <w:jc w:val="right"/>
             </w:pPr>
             <w:r>
@@ -2260,11 +2459,11 @@
       <w:tr>
         <w:tc>
           <w:tcPr>
-            <w:tcW w:type="dxa" w:w="6236"/>
+            <w:tcW w:type="dxa" w:w="5386"/>
           </w:tcPr>
           <w:p>
             <w:pPr>
-              <w:spacing w:before="20" w:after="20"/>
+              <w:spacing w:before="40" w:after="40" w:line="276" w:lineRule="auto"/>
               <w:ind w:left="283"/>
             </w:pPr>
             <w:r>
@@ -2287,24 +2486,29 @@
         </w:tc>
         <w:tc>
           <w:tcPr>
-            <w:tcW w:type="dxa" w:w="2835"/>
-            <w:tcBorders>
-              <w:top w:val="nil"/>
-              <w:left w:val="nil"/>
-              <w:right w:val="nil"/>
-              <w:bottom w:val="dotted" w:sz="12" w:space="1" w:color="000000"/>
-            </w:tcBorders>
+            <w:tcW w:type="dxa" w:w="3118"/>
           </w:tcPr>
           <w:p>
-            <w:r/>
+            <w:pPr>
+              <w:spacing w:before="40" w:after="40"/>
+            </w:pPr>
+            <w:r>
+              <w:rPr>
+                <w:rFonts w:ascii="Times New Roman" w:hAnsi="Times New Roman"/>
+                <w:b w:val="0"/>
+                <w:sz w:val="24"/>
+              </w:rPr>
+              <w:t xml:space="preserve">. . . . . . . . . . . . . . . . </w:t>
+            </w:r>
           </w:p>
         </w:tc>
         <w:tc>
           <w:tcPr>
-            <w:tcW w:type="dxa" w:w="907"/>
+            <w:tcW w:type="dxa" w:w="1020"/>
           </w:tcPr>
           <w:p>
             <w:pPr>
+              <w:spacing w:before="40" w:after="40"/>
               <w:jc w:val="right"/>
             </w:pPr>
             <w:r>
@@ -2321,11 +2525,11 @@
       <w:tr>
         <w:tc>
           <w:tcPr>
-            <w:tcW w:type="dxa" w:w="6236"/>
+            <w:tcW w:type="dxa" w:w="5386"/>
           </w:tcPr>
           <w:p>
             <w:pPr>
-              <w:spacing w:before="20" w:after="20"/>
+              <w:spacing w:before="40" w:after="40" w:line="276" w:lineRule="auto"/>
               <w:ind w:left="283"/>
             </w:pPr>
             <w:r>
@@ -2348,24 +2552,29 @@
         </w:tc>
         <w:tc>
           <w:tcPr>
-            <w:tcW w:type="dxa" w:w="2835"/>
-            <w:tcBorders>
-              <w:top w:val="nil"/>
-              <w:left w:val="nil"/>
-              <w:right w:val="nil"/>
-              <w:bottom w:val="dotted" w:sz="12" w:space="1" w:color="000000"/>
-            </w:tcBorders>
+            <w:tcW w:type="dxa" w:w="3118"/>
           </w:tcPr>
           <w:p>
-            <w:r/>
+            <w:pPr>
+              <w:spacing w:before="40" w:after="40"/>
+            </w:pPr>
+            <w:r>
+              <w:rPr>
+                <w:rFonts w:ascii="Times New Roman" w:hAnsi="Times New Roman"/>
+                <w:b w:val="0"/>
+                <w:sz w:val="24"/>
+              </w:rPr>
+              <w:t xml:space="preserve">. . . . . . . . . . . . . . . . </w:t>
+            </w:r>
           </w:p>
         </w:tc>
         <w:tc>
           <w:tcPr>
-            <w:tcW w:type="dxa" w:w="907"/>
+            <w:tcW w:type="dxa" w:w="1020"/>
           </w:tcPr>
           <w:p>
             <w:pPr>
+              <w:spacing w:before="40" w:after="40"/>
               <w:jc w:val="right"/>
             </w:pPr>
             <w:r>
@@ -2382,11 +2591,11 @@
       <w:tr>
         <w:tc>
           <w:tcPr>
-            <w:tcW w:type="dxa" w:w="6236"/>
+            <w:tcW w:type="dxa" w:w="5386"/>
           </w:tcPr>
           <w:p>
             <w:pPr>
-              <w:spacing w:before="20" w:after="20"/>
+              <w:spacing w:before="40" w:after="40" w:line="276" w:lineRule="auto"/>
               <w:ind w:left="283"/>
             </w:pPr>
             <w:r>
@@ -2409,24 +2618,29 @@
         </w:tc>
         <w:tc>
           <w:tcPr>
-            <w:tcW w:type="dxa" w:w="2835"/>
-            <w:tcBorders>
-              <w:top w:val="nil"/>
-              <w:left w:val="nil"/>
-              <w:right w:val="nil"/>
-              <w:bottom w:val="dotted" w:sz="12" w:space="1" w:color="000000"/>
-            </w:tcBorders>
+            <w:tcW w:type="dxa" w:w="3118"/>
           </w:tcPr>
           <w:p>
-            <w:r/>
+            <w:pPr>
+              <w:spacing w:before="40" w:after="40"/>
+            </w:pPr>
+            <w:r>
+              <w:rPr>
+                <w:rFonts w:ascii="Times New Roman" w:hAnsi="Times New Roman"/>
+                <w:b w:val="0"/>
+                <w:sz w:val="24"/>
+              </w:rPr>
+              <w:t xml:space="preserve">. . . . . . . . . . . . . . . . </w:t>
+            </w:r>
           </w:p>
         </w:tc>
         <w:tc>
           <w:tcPr>
-            <w:tcW w:type="dxa" w:w="907"/>
+            <w:tcW w:type="dxa" w:w="1020"/>
           </w:tcPr>
           <w:p>
             <w:pPr>
+              <w:spacing w:before="40" w:after="40"/>
               <w:jc w:val="right"/>
             </w:pPr>
             <w:r>
@@ -2443,11 +2657,11 @@
       <w:tr>
         <w:tc>
           <w:tcPr>
-            <w:tcW w:type="dxa" w:w="6236"/>
+            <w:tcW w:type="dxa" w:w="5386"/>
           </w:tcPr>
           <w:p>
             <w:pPr>
-              <w:spacing w:before="20" w:after="20"/>
+              <w:spacing w:before="40" w:after="40" w:line="276" w:lineRule="auto"/>
               <w:ind w:left="283"/>
             </w:pPr>
             <w:r>
@@ -2470,24 +2684,29 @@
         </w:tc>
         <w:tc>
           <w:tcPr>
-            <w:tcW w:type="dxa" w:w="2835"/>
-            <w:tcBorders>
-              <w:top w:val="nil"/>
-              <w:left w:val="nil"/>
-              <w:right w:val="nil"/>
-              <w:bottom w:val="dotted" w:sz="12" w:space="1" w:color="000000"/>
-            </w:tcBorders>
+            <w:tcW w:type="dxa" w:w="3118"/>
           </w:tcPr>
           <w:p>
-            <w:r/>
+            <w:pPr>
+              <w:spacing w:before="40" w:after="40"/>
+            </w:pPr>
+            <w:r>
+              <w:rPr>
+                <w:rFonts w:ascii="Times New Roman" w:hAnsi="Times New Roman"/>
+                <w:b w:val="0"/>
+                <w:sz w:val="24"/>
+              </w:rPr>
+              <w:t xml:space="preserve">. . . . . . . . . . . . . . . . </w:t>
+            </w:r>
           </w:p>
         </w:tc>
         <w:tc>
           <w:tcPr>
-            <w:tcW w:type="dxa" w:w="907"/>
+            <w:tcW w:type="dxa" w:w="1020"/>
           </w:tcPr>
           <w:p>
             <w:pPr>
+              <w:spacing w:before="40" w:after="40"/>
               <w:jc w:val="right"/>
             </w:pPr>
             <w:r>
@@ -2504,11 +2723,11 @@
       <w:tr>
         <w:tc>
           <w:tcPr>
-            <w:tcW w:type="dxa" w:w="6236"/>
+            <w:tcW w:type="dxa" w:w="5386"/>
           </w:tcPr>
           <w:p>
             <w:pPr>
-              <w:spacing w:before="20" w:after="20"/>
+              <w:spacing w:before="40" w:after="40" w:line="276" w:lineRule="auto"/>
               <w:ind w:left="283"/>
             </w:pPr>
             <w:r>
@@ -2531,24 +2750,29 @@
         </w:tc>
         <w:tc>
           <w:tcPr>
-            <w:tcW w:type="dxa" w:w="2835"/>
-            <w:tcBorders>
-              <w:top w:val="nil"/>
-              <w:left w:val="nil"/>
-              <w:right w:val="nil"/>
-              <w:bottom w:val="dotted" w:sz="12" w:space="1" w:color="000000"/>
-            </w:tcBorders>
+            <w:tcW w:type="dxa" w:w="3118"/>
           </w:tcPr>
           <w:p>
-            <w:r/>
+            <w:pPr>
+              <w:spacing w:before="40" w:after="40"/>
+            </w:pPr>
+            <w:r>
+              <w:rPr>
+                <w:rFonts w:ascii="Times New Roman" w:hAnsi="Times New Roman"/>
+                <w:b w:val="0"/>
+                <w:sz w:val="24"/>
+              </w:rPr>
+              <w:t xml:space="preserve">. . . . . . . . . . . . . . . . </w:t>
+            </w:r>
           </w:p>
         </w:tc>
         <w:tc>
           <w:tcPr>
-            <w:tcW w:type="dxa" w:w="907"/>
+            <w:tcW w:type="dxa" w:w="1020"/>
           </w:tcPr>
           <w:p>
             <w:pPr>
+              <w:spacing w:before="40" w:after="40"/>
               <w:jc w:val="right"/>
             </w:pPr>
             <w:r>
@@ -2565,11 +2789,11 @@
       <w:tr>
         <w:tc>
           <w:tcPr>
-            <w:tcW w:type="dxa" w:w="6236"/>
+            <w:tcW w:type="dxa" w:w="5386"/>
           </w:tcPr>
           <w:p>
             <w:pPr>
-              <w:spacing w:before="20" w:after="20"/>
+              <w:spacing w:before="40" w:after="40" w:line="276" w:lineRule="auto"/>
             </w:pPr>
             <w:r>
               <w:rPr>
@@ -2583,24 +2807,29 @@
         </w:tc>
         <w:tc>
           <w:tcPr>
-            <w:tcW w:type="dxa" w:w="2835"/>
-            <w:tcBorders>
-              <w:top w:val="nil"/>
-              <w:left w:val="nil"/>
-              <w:right w:val="nil"/>
-              <w:bottom w:val="dotted" w:sz="12" w:space="1" w:color="000000"/>
-            </w:tcBorders>
+            <w:tcW w:type="dxa" w:w="3118"/>
           </w:tcPr>
           <w:p>
-            <w:r/>
+            <w:pPr>
+              <w:spacing w:before="40" w:after="40"/>
+            </w:pPr>
+            <w:r>
+              <w:rPr>
+                <w:rFonts w:ascii="Times New Roman" w:hAnsi="Times New Roman"/>
+                <w:b w:val="0"/>
+                <w:sz w:val="24"/>
+              </w:rPr>
+              <w:t xml:space="preserve">. . . . . . . . . . . . . . . . </w:t>
+            </w:r>
           </w:p>
         </w:tc>
         <w:tc>
           <w:tcPr>
-            <w:tcW w:type="dxa" w:w="907"/>
+            <w:tcW w:type="dxa" w:w="1020"/>
           </w:tcPr>
           <w:p>
             <w:pPr>
+              <w:spacing w:before="40" w:after="40"/>
               <w:jc w:val="right"/>
             </w:pPr>
             <w:r>
@@ -2617,11 +2846,11 @@
       <w:tr>
         <w:tc>
           <w:tcPr>
-            <w:tcW w:type="dxa" w:w="6236"/>
+            <w:tcW w:type="dxa" w:w="5386"/>
           </w:tcPr>
           <w:p>
             <w:pPr>
-              <w:spacing w:before="20" w:after="20"/>
+              <w:spacing w:before="40" w:after="40" w:line="276" w:lineRule="auto"/>
               <w:ind w:left="283"/>
             </w:pPr>
             <w:r>
@@ -2644,24 +2873,29 @@
         </w:tc>
         <w:tc>
           <w:tcPr>
-            <w:tcW w:type="dxa" w:w="2835"/>
-            <w:tcBorders>
-              <w:top w:val="nil"/>
-              <w:left w:val="nil"/>
-              <w:right w:val="nil"/>
-              <w:bottom w:val="dotted" w:sz="12" w:space="1" w:color="000000"/>
-            </w:tcBorders>
+            <w:tcW w:type="dxa" w:w="3118"/>
           </w:tcPr>
           <w:p>
-            <w:r/>
+            <w:pPr>
+              <w:spacing w:before="40" w:after="40"/>
+            </w:pPr>
+            <w:r>
+              <w:rPr>
+                <w:rFonts w:ascii="Times New Roman" w:hAnsi="Times New Roman"/>
+                <w:b w:val="0"/>
+                <w:sz w:val="24"/>
+              </w:rPr>
+              <w:t xml:space="preserve">. . . . . . . . . . . . . . . . </w:t>
+            </w:r>
           </w:p>
         </w:tc>
         <w:tc>
           <w:tcPr>
-            <w:tcW w:type="dxa" w:w="907"/>
+            <w:tcW w:type="dxa" w:w="1020"/>
           </w:tcPr>
           <w:p>
             <w:pPr>
+              <w:spacing w:before="40" w:after="40"/>
               <w:jc w:val="right"/>
             </w:pPr>
             <w:r>
@@ -2678,11 +2912,11 @@
       <w:tr>
         <w:tc>
           <w:tcPr>
-            <w:tcW w:type="dxa" w:w="6236"/>
+            <w:tcW w:type="dxa" w:w="5386"/>
           </w:tcPr>
           <w:p>
             <w:pPr>
-              <w:spacing w:before="20" w:after="20"/>
+              <w:spacing w:before="40" w:after="40" w:line="276" w:lineRule="auto"/>
               <w:ind w:left="283"/>
             </w:pPr>
             <w:r>
@@ -2705,24 +2939,29 @@
         </w:tc>
         <w:tc>
           <w:tcPr>
-            <w:tcW w:type="dxa" w:w="2835"/>
-            <w:tcBorders>
-              <w:top w:val="nil"/>
-              <w:left w:val="nil"/>
-              <w:right w:val="nil"/>
-              <w:bottom w:val="dotted" w:sz="12" w:space="1" w:color="000000"/>
-            </w:tcBorders>
+            <w:tcW w:type="dxa" w:w="3118"/>
           </w:tcPr>
           <w:p>
-            <w:r/>
+            <w:pPr>
+              <w:spacing w:before="40" w:after="40"/>
+            </w:pPr>
+            <w:r>
+              <w:rPr>
+                <w:rFonts w:ascii="Times New Roman" w:hAnsi="Times New Roman"/>
+                <w:b w:val="0"/>
+                <w:sz w:val="24"/>
+              </w:rPr>
+              <w:t xml:space="preserve">. . . . . . . . . . . . . . . . </w:t>
+            </w:r>
           </w:p>
         </w:tc>
         <w:tc>
           <w:tcPr>
-            <w:tcW w:type="dxa" w:w="907"/>
+            <w:tcW w:type="dxa" w:w="1020"/>
           </w:tcPr>
           <w:p>
             <w:pPr>
+              <w:spacing w:before="40" w:after="40"/>
               <w:jc w:val="right"/>
             </w:pPr>
             <w:r>
@@ -2739,11 +2978,11 @@
       <w:tr>
         <w:tc>
           <w:tcPr>
-            <w:tcW w:type="dxa" w:w="6236"/>
+            <w:tcW w:type="dxa" w:w="5386"/>
           </w:tcPr>
           <w:p>
             <w:pPr>
-              <w:spacing w:before="20" w:after="20"/>
+              <w:spacing w:before="40" w:after="40" w:line="276" w:lineRule="auto"/>
               <w:ind w:left="283"/>
             </w:pPr>
             <w:r>
@@ -2766,24 +3005,29 @@
         </w:tc>
         <w:tc>
           <w:tcPr>
-            <w:tcW w:type="dxa" w:w="2835"/>
-            <w:tcBorders>
-              <w:top w:val="nil"/>
-              <w:left w:val="nil"/>
-              <w:right w:val="nil"/>
-              <w:bottom w:val="dotted" w:sz="12" w:space="1" w:color="000000"/>
-            </w:tcBorders>
+            <w:tcW w:type="dxa" w:w="3118"/>
           </w:tcPr>
           <w:p>
-            <w:r/>
+            <w:pPr>
+              <w:spacing w:before="40" w:after="40"/>
+            </w:pPr>
+            <w:r>
+              <w:rPr>
+                <w:rFonts w:ascii="Times New Roman" w:hAnsi="Times New Roman"/>
+                <w:b w:val="0"/>
+                <w:sz w:val="24"/>
+              </w:rPr>
+              <w:t xml:space="preserve">. . . . . . . . . . . . . . . . </w:t>
+            </w:r>
           </w:p>
         </w:tc>
         <w:tc>
           <w:tcPr>
-            <w:tcW w:type="dxa" w:w="907"/>
+            <w:tcW w:type="dxa" w:w="1020"/>
           </w:tcPr>
           <w:p>
             <w:pPr>
+              <w:spacing w:before="40" w:after="40"/>
               <w:jc w:val="right"/>
             </w:pPr>
             <w:r>
@@ -2800,11 +3044,11 @@
       <w:tr>
         <w:tc>
           <w:tcPr>
-            <w:tcW w:type="dxa" w:w="6236"/>
+            <w:tcW w:type="dxa" w:w="5386"/>
           </w:tcPr>
           <w:p>
             <w:pPr>
-              <w:spacing w:before="20" w:after="20"/>
+              <w:spacing w:before="40" w:after="40" w:line="276" w:lineRule="auto"/>
               <w:ind w:left="283"/>
             </w:pPr>
             <w:r>
@@ -2827,24 +3071,29 @@
         </w:tc>
         <w:tc>
           <w:tcPr>
-            <w:tcW w:type="dxa" w:w="2835"/>
-            <w:tcBorders>
-              <w:top w:val="nil"/>
-              <w:left w:val="nil"/>
-              <w:right w:val="nil"/>
-              <w:bottom w:val="dotted" w:sz="12" w:space="1" w:color="000000"/>
-            </w:tcBorders>
+            <w:tcW w:type="dxa" w:w="3118"/>
           </w:tcPr>
           <w:p>
-            <w:r/>
+            <w:pPr>
+              <w:spacing w:before="40" w:after="40"/>
+            </w:pPr>
+            <w:r>
+              <w:rPr>
+                <w:rFonts w:ascii="Times New Roman" w:hAnsi="Times New Roman"/>
+                <w:b w:val="0"/>
+                <w:sz w:val="24"/>
+              </w:rPr>
+              <w:t xml:space="preserve">. . . . . . . . . . . . . . . . </w:t>
+            </w:r>
           </w:p>
         </w:tc>
         <w:tc>
           <w:tcPr>
-            <w:tcW w:type="dxa" w:w="907"/>
+            <w:tcW w:type="dxa" w:w="1020"/>
           </w:tcPr>
           <w:p>
             <w:pPr>
+              <w:spacing w:before="40" w:after="40"/>
               <w:jc w:val="right"/>
             </w:pPr>
             <w:r>
@@ -2861,11 +3110,11 @@
       <w:tr>
         <w:tc>
           <w:tcPr>
-            <w:tcW w:type="dxa" w:w="6236"/>
+            <w:tcW w:type="dxa" w:w="5386"/>
           </w:tcPr>
           <w:p>
             <w:pPr>
-              <w:spacing w:before="20" w:after="20"/>
+              <w:spacing w:before="40" w:after="40" w:line="276" w:lineRule="auto"/>
               <w:ind w:left="283"/>
             </w:pPr>
             <w:r>
@@ -2888,24 +3137,29 @@
         </w:tc>
         <w:tc>
           <w:tcPr>
-            <w:tcW w:type="dxa" w:w="2835"/>
-            <w:tcBorders>
-              <w:top w:val="nil"/>
-              <w:left w:val="nil"/>
-              <w:right w:val="nil"/>
-              <w:bottom w:val="dotted" w:sz="12" w:space="1" w:color="000000"/>
-            </w:tcBorders>
+            <w:tcW w:type="dxa" w:w="3118"/>
           </w:tcPr>
           <w:p>
-            <w:r/>
+            <w:pPr>
+              <w:spacing w:before="40" w:after="40"/>
+            </w:pPr>
+            <w:r>
+              <w:rPr>
+                <w:rFonts w:ascii="Times New Roman" w:hAnsi="Times New Roman"/>
+                <w:b w:val="0"/>
+                <w:sz w:val="24"/>
+              </w:rPr>
+              <w:t xml:space="preserve">. . . . . . . . . . . . . . . . </w:t>
+            </w:r>
           </w:p>
         </w:tc>
         <w:tc>
           <w:tcPr>
-            <w:tcW w:type="dxa" w:w="907"/>
+            <w:tcW w:type="dxa" w:w="1020"/>
           </w:tcPr>
           <w:p>
             <w:pPr>
+              <w:spacing w:before="40" w:after="40"/>
               <w:jc w:val="right"/>
             </w:pPr>
             <w:r>
@@ -2922,11 +3176,11 @@
       <w:tr>
         <w:tc>
           <w:tcPr>
-            <w:tcW w:type="dxa" w:w="6236"/>
+            <w:tcW w:type="dxa" w:w="5386"/>
           </w:tcPr>
           <w:p>
             <w:pPr>
-              <w:spacing w:before="20" w:after="20"/>
+              <w:spacing w:before="40" w:after="40" w:line="276" w:lineRule="auto"/>
               <w:ind w:left="283"/>
             </w:pPr>
             <w:r>
@@ -2949,24 +3203,29 @@
         </w:tc>
         <w:tc>
           <w:tcPr>
-            <w:tcW w:type="dxa" w:w="2835"/>
-            <w:tcBorders>
-              <w:top w:val="nil"/>
-              <w:left w:val="nil"/>
-              <w:right w:val="nil"/>
-              <w:bottom w:val="dotted" w:sz="12" w:space="1" w:color="000000"/>
-            </w:tcBorders>
+            <w:tcW w:type="dxa" w:w="3118"/>
           </w:tcPr>
           <w:p>
-            <w:r/>
+            <w:pPr>
+              <w:spacing w:before="40" w:after="40"/>
+            </w:pPr>
+            <w:r>
+              <w:rPr>
+                <w:rFonts w:ascii="Times New Roman" w:hAnsi="Times New Roman"/>
+                <w:b w:val="0"/>
+                <w:sz w:val="24"/>
+              </w:rPr>
+              <w:t xml:space="preserve">. . . . . . . . . . . . . . . . </w:t>
+            </w:r>
           </w:p>
         </w:tc>
         <w:tc>
           <w:tcPr>
-            <w:tcW w:type="dxa" w:w="907"/>
+            <w:tcW w:type="dxa" w:w="1020"/>
           </w:tcPr>
           <w:p>
             <w:pPr>
+              <w:spacing w:before="40" w:after="40"/>
               <w:jc w:val="right"/>
             </w:pPr>
             <w:r>
@@ -2983,11 +3242,11 @@
       <w:tr>
         <w:tc>
           <w:tcPr>
-            <w:tcW w:type="dxa" w:w="6236"/>
+            <w:tcW w:type="dxa" w:w="5386"/>
           </w:tcPr>
           <w:p>
             <w:pPr>
-              <w:spacing w:before="20" w:after="20"/>
+              <w:spacing w:before="40" w:after="40" w:line="276" w:lineRule="auto"/>
               <w:ind w:left="283"/>
             </w:pPr>
             <w:r>
@@ -3010,24 +3269,29 @@
         </w:tc>
         <w:tc>
           <w:tcPr>
-            <w:tcW w:type="dxa" w:w="2835"/>
-            <w:tcBorders>
-              <w:top w:val="nil"/>
-              <w:left w:val="nil"/>
-              <w:right w:val="nil"/>
-              <w:bottom w:val="dotted" w:sz="12" w:space="1" w:color="000000"/>
-            </w:tcBorders>
+            <w:tcW w:type="dxa" w:w="3118"/>
           </w:tcPr>
           <w:p>
-            <w:r/>
+            <w:pPr>
+              <w:spacing w:before="40" w:after="40"/>
+            </w:pPr>
+            <w:r>
+              <w:rPr>
+                <w:rFonts w:ascii="Times New Roman" w:hAnsi="Times New Roman"/>
+                <w:b w:val="0"/>
+                <w:sz w:val="24"/>
+              </w:rPr>
+              <w:t xml:space="preserve">. . . . . . . . . . . . . . . . </w:t>
+            </w:r>
           </w:p>
         </w:tc>
         <w:tc>
           <w:tcPr>
-            <w:tcW w:type="dxa" w:w="907"/>
+            <w:tcW w:type="dxa" w:w="1020"/>
           </w:tcPr>
           <w:p>
             <w:pPr>
+              <w:spacing w:before="40" w:after="40"/>
               <w:jc w:val="right"/>
             </w:pPr>
             <w:r>
@@ -3044,11 +3308,11 @@
       <w:tr>
         <w:tc>
           <w:tcPr>
-            <w:tcW w:type="dxa" w:w="6236"/>
+            <w:tcW w:type="dxa" w:w="5386"/>
           </w:tcPr>
           <w:p>
             <w:pPr>
-              <w:spacing w:before="20" w:after="20"/>
+              <w:spacing w:before="40" w:after="40" w:line="276" w:lineRule="auto"/>
               <w:ind w:left="283"/>
             </w:pPr>
             <w:r>
@@ -3071,24 +3335,29 @@
         </w:tc>
         <w:tc>
           <w:tcPr>
-            <w:tcW w:type="dxa" w:w="2835"/>
-            <w:tcBorders>
-              <w:top w:val="nil"/>
-              <w:left w:val="nil"/>
-              <w:right w:val="nil"/>
-              <w:bottom w:val="dotted" w:sz="12" w:space="1" w:color="000000"/>
-            </w:tcBorders>
+            <w:tcW w:type="dxa" w:w="3118"/>
           </w:tcPr>
           <w:p>
-            <w:r/>
+            <w:pPr>
+              <w:spacing w:before="40" w:after="40"/>
+            </w:pPr>
+            <w:r>
+              <w:rPr>
+                <w:rFonts w:ascii="Times New Roman" w:hAnsi="Times New Roman"/>
+                <w:b w:val="0"/>
+                <w:sz w:val="24"/>
+              </w:rPr>
+              <w:t xml:space="preserve">. . . . . . . . . . . . . . . . </w:t>
+            </w:r>
           </w:p>
         </w:tc>
         <w:tc>
           <w:tcPr>
-            <w:tcW w:type="dxa" w:w="907"/>
+            <w:tcW w:type="dxa" w:w="1020"/>
           </w:tcPr>
           <w:p>
             <w:pPr>
+              <w:spacing w:before="40" w:after="40"/>
               <w:jc w:val="right"/>
             </w:pPr>
             <w:r>
@@ -3105,11 +3374,11 @@
       <w:tr>
         <w:tc>
           <w:tcPr>
-            <w:tcW w:type="dxa" w:w="6236"/>
+            <w:tcW w:type="dxa" w:w="5386"/>
           </w:tcPr>
           <w:p>
             <w:pPr>
-              <w:spacing w:before="20" w:after="20"/>
+              <w:spacing w:before="40" w:after="40" w:line="276" w:lineRule="auto"/>
               <w:ind w:left="283"/>
             </w:pPr>
             <w:r>
@@ -3132,24 +3401,29 @@
         </w:tc>
         <w:tc>
           <w:tcPr>
-            <w:tcW w:type="dxa" w:w="2835"/>
-            <w:tcBorders>
-              <w:top w:val="nil"/>
-              <w:left w:val="nil"/>
-              <w:right w:val="nil"/>
-              <w:bottom w:val="dotted" w:sz="12" w:space="1" w:color="000000"/>
-            </w:tcBorders>
+            <w:tcW w:type="dxa" w:w="3118"/>
           </w:tcPr>
           <w:p>
-            <w:r/>
+            <w:pPr>
+              <w:spacing w:before="40" w:after="40"/>
+            </w:pPr>
+            <w:r>
+              <w:rPr>
+                <w:rFonts w:ascii="Times New Roman" w:hAnsi="Times New Roman"/>
+                <w:b w:val="0"/>
+                <w:sz w:val="24"/>
+              </w:rPr>
+              <w:t xml:space="preserve">. . . . . . . . . . . . . . . . </w:t>
+            </w:r>
           </w:p>
         </w:tc>
         <w:tc>
           <w:tcPr>
-            <w:tcW w:type="dxa" w:w="907"/>
+            <w:tcW w:type="dxa" w:w="1020"/>
           </w:tcPr>
           <w:p>
             <w:pPr>
+              <w:spacing w:before="40" w:after="40"/>
               <w:jc w:val="right"/>
             </w:pPr>
             <w:r>
@@ -3166,11 +3440,11 @@
       <w:tr>
         <w:tc>
           <w:tcPr>
-            <w:tcW w:type="dxa" w:w="6236"/>
+            <w:tcW w:type="dxa" w:w="5386"/>
           </w:tcPr>
           <w:p>
             <w:pPr>
-              <w:spacing w:before="20" w:after="20"/>
+              <w:spacing w:before="40" w:after="40" w:line="276" w:lineRule="auto"/>
               <w:ind w:left="283"/>
             </w:pPr>
             <w:r>
@@ -3193,24 +3467,29 @@
         </w:tc>
         <w:tc>
           <w:tcPr>
-            <w:tcW w:type="dxa" w:w="2835"/>
-            <w:tcBorders>
-              <w:top w:val="nil"/>
-              <w:left w:val="nil"/>
-              <w:right w:val="nil"/>
-              <w:bottom w:val="dotted" w:sz="12" w:space="1" w:color="000000"/>
-            </w:tcBorders>
+            <w:tcW w:type="dxa" w:w="3118"/>
           </w:tcPr>
           <w:p>
-            <w:r/>
+            <w:pPr>
+              <w:spacing w:before="40" w:after="40"/>
+            </w:pPr>
+            <w:r>
+              <w:rPr>
+                <w:rFonts w:ascii="Times New Roman" w:hAnsi="Times New Roman"/>
+                <w:b w:val="0"/>
+                <w:sz w:val="24"/>
+              </w:rPr>
+              <w:t xml:space="preserve">. . . . . . . . . . . . . . . . </w:t>
+            </w:r>
           </w:p>
         </w:tc>
         <w:tc>
           <w:tcPr>
-            <w:tcW w:type="dxa" w:w="907"/>
+            <w:tcW w:type="dxa" w:w="1020"/>
           </w:tcPr>
           <w:p>
             <w:pPr>
+              <w:spacing w:before="40" w:after="40"/>
               <w:jc w:val="right"/>
             </w:pPr>
             <w:r>
@@ -3227,11 +3506,11 @@
       <w:tr>
         <w:tc>
           <w:tcPr>
-            <w:tcW w:type="dxa" w:w="6236"/>
+            <w:tcW w:type="dxa" w:w="5386"/>
           </w:tcPr>
           <w:p>
             <w:pPr>
-              <w:spacing w:before="20" w:after="20"/>
+              <w:spacing w:before="40" w:after="40" w:line="276" w:lineRule="auto"/>
               <w:ind w:left="283"/>
             </w:pPr>
             <w:r>
@@ -3254,24 +3533,29 @@
         </w:tc>
         <w:tc>
           <w:tcPr>
-            <w:tcW w:type="dxa" w:w="2835"/>
-            <w:tcBorders>
-              <w:top w:val="nil"/>
-              <w:left w:val="nil"/>
-              <w:right w:val="nil"/>
-              <w:bottom w:val="dotted" w:sz="12" w:space="1" w:color="000000"/>
-            </w:tcBorders>
+            <w:tcW w:type="dxa" w:w="3118"/>
           </w:tcPr>
           <w:p>
-            <w:r/>
+            <w:pPr>
+              <w:spacing w:before="40" w:after="40"/>
+            </w:pPr>
+            <w:r>
+              <w:rPr>
+                <w:rFonts w:ascii="Times New Roman" w:hAnsi="Times New Roman"/>
+                <w:b w:val="0"/>
+                <w:sz w:val="24"/>
+              </w:rPr>
+              <w:t xml:space="preserve">. . . . . . . . . . . . . . . . </w:t>
+            </w:r>
           </w:p>
         </w:tc>
         <w:tc>
           <w:tcPr>
-            <w:tcW w:type="dxa" w:w="907"/>
+            <w:tcW w:type="dxa" w:w="1020"/>
           </w:tcPr>
           <w:p>
             <w:pPr>
+              <w:spacing w:before="40" w:after="40"/>
               <w:jc w:val="right"/>
             </w:pPr>
             <w:r>
@@ -3288,11 +3572,11 @@
       <w:tr>
         <w:tc>
           <w:tcPr>
-            <w:tcW w:type="dxa" w:w="6236"/>
+            <w:tcW w:type="dxa" w:w="5386"/>
           </w:tcPr>
           <w:p>
             <w:pPr>
-              <w:spacing w:before="20" w:after="20"/>
+              <w:spacing w:before="40" w:after="40" w:line="276" w:lineRule="auto"/>
             </w:pPr>
             <w:r>
               <w:rPr>
@@ -3306,24 +3590,29 @@
         </w:tc>
         <w:tc>
           <w:tcPr>
-            <w:tcW w:type="dxa" w:w="2835"/>
-            <w:tcBorders>
-              <w:top w:val="nil"/>
-              <w:left w:val="nil"/>
-              <w:right w:val="nil"/>
-              <w:bottom w:val="dotted" w:sz="12" w:space="1" w:color="000000"/>
-            </w:tcBorders>
+            <w:tcW w:type="dxa" w:w="3118"/>
           </w:tcPr>
           <w:p>
-            <w:r/>
+            <w:pPr>
+              <w:spacing w:before="40" w:after="40"/>
+            </w:pPr>
+            <w:r>
+              <w:rPr>
+                <w:rFonts w:ascii="Times New Roman" w:hAnsi="Times New Roman"/>
+                <w:b w:val="0"/>
+                <w:sz w:val="24"/>
+              </w:rPr>
+              <w:t xml:space="preserve">. . . . . . . . . . . . . . . . </w:t>
+            </w:r>
           </w:p>
         </w:tc>
         <w:tc>
           <w:tcPr>
-            <w:tcW w:type="dxa" w:w="907"/>
+            <w:tcW w:type="dxa" w:w="1020"/>
           </w:tcPr>
           <w:p>
             <w:pPr>
+              <w:spacing w:before="40" w:after="40"/>
               <w:jc w:val="right"/>
             </w:pPr>
             <w:r>
@@ -3340,11 +3629,11 @@
       <w:tr>
         <w:tc>
           <w:tcPr>
-            <w:tcW w:type="dxa" w:w="6236"/>
+            <w:tcW w:type="dxa" w:w="5386"/>
           </w:tcPr>
           <w:p>
             <w:pPr>
-              <w:spacing w:before="20" w:after="20"/>
+              <w:spacing w:before="40" w:after="40" w:line="276" w:lineRule="auto"/>
               <w:ind w:left="283"/>
             </w:pPr>
             <w:r>
@@ -3367,24 +3656,29 @@
         </w:tc>
         <w:tc>
           <w:tcPr>
-            <w:tcW w:type="dxa" w:w="2835"/>
-            <w:tcBorders>
-              <w:top w:val="nil"/>
-              <w:left w:val="nil"/>
-              <w:right w:val="nil"/>
-              <w:bottom w:val="dotted" w:sz="12" w:space="1" w:color="000000"/>
-            </w:tcBorders>
+            <w:tcW w:type="dxa" w:w="3118"/>
           </w:tcPr>
           <w:p>
-            <w:r/>
+            <w:pPr>
+              <w:spacing w:before="40" w:after="40"/>
+            </w:pPr>
+            <w:r>
+              <w:rPr>
+                <w:rFonts w:ascii="Times New Roman" w:hAnsi="Times New Roman"/>
+                <w:b w:val="0"/>
+                <w:sz w:val="24"/>
+              </w:rPr>
+              <w:t xml:space="preserve">. . . . . . . . . . . . . . . . </w:t>
+            </w:r>
           </w:p>
         </w:tc>
         <w:tc>
           <w:tcPr>
-            <w:tcW w:type="dxa" w:w="907"/>
+            <w:tcW w:type="dxa" w:w="1020"/>
           </w:tcPr>
           <w:p>
             <w:pPr>
+              <w:spacing w:before="40" w:after="40"/>
               <w:jc w:val="right"/>
             </w:pPr>
             <w:r>
@@ -3401,11 +3695,11 @@
       <w:tr>
         <w:tc>
           <w:tcPr>
-            <w:tcW w:type="dxa" w:w="6236"/>
+            <w:tcW w:type="dxa" w:w="5386"/>
           </w:tcPr>
           <w:p>
             <w:pPr>
-              <w:spacing w:before="20" w:after="20"/>
+              <w:spacing w:before="40" w:after="40" w:line="276" w:lineRule="auto"/>
               <w:ind w:left="283"/>
             </w:pPr>
             <w:r>
@@ -3428,24 +3722,29 @@
         </w:tc>
         <w:tc>
           <w:tcPr>
-            <w:tcW w:type="dxa" w:w="2835"/>
-            <w:tcBorders>
-              <w:top w:val="nil"/>
-              <w:left w:val="nil"/>
-              <w:right w:val="nil"/>
-              <w:bottom w:val="dotted" w:sz="12" w:space="1" w:color="000000"/>
-            </w:tcBorders>
+            <w:tcW w:type="dxa" w:w="3118"/>
           </w:tcPr>
           <w:p>
-            <w:r/>
+            <w:pPr>
+              <w:spacing w:before="40" w:after="40"/>
+            </w:pPr>
+            <w:r>
+              <w:rPr>
+                <w:rFonts w:ascii="Times New Roman" w:hAnsi="Times New Roman"/>
+                <w:b w:val="0"/>
+                <w:sz w:val="24"/>
+              </w:rPr>
+              <w:t xml:space="preserve">. . . . . . . . . . . . . . . . </w:t>
+            </w:r>
           </w:p>
         </w:tc>
         <w:tc>
           <w:tcPr>
-            <w:tcW w:type="dxa" w:w="907"/>
+            <w:tcW w:type="dxa" w:w="1020"/>
           </w:tcPr>
           <w:p>
             <w:pPr>
+              <w:spacing w:before="40" w:after="40"/>
               <w:jc w:val="right"/>
             </w:pPr>
             <w:r>
@@ -3462,11 +3761,11 @@
       <w:tr>
         <w:tc>
           <w:tcPr>
-            <w:tcW w:type="dxa" w:w="6236"/>
+            <w:tcW w:type="dxa" w:w="5386"/>
           </w:tcPr>
           <w:p>
             <w:pPr>
-              <w:spacing w:before="20" w:after="20"/>
+              <w:spacing w:before="40" w:after="40" w:line="276" w:lineRule="auto"/>
               <w:ind w:left="283"/>
             </w:pPr>
             <w:r>
@@ -3489,24 +3788,29 @@
         </w:tc>
         <w:tc>
           <w:tcPr>
-            <w:tcW w:type="dxa" w:w="2835"/>
-            <w:tcBorders>
-              <w:top w:val="nil"/>
-              <w:left w:val="nil"/>
-              <w:right w:val="nil"/>
-              <w:bottom w:val="dotted" w:sz="12" w:space="1" w:color="000000"/>
-            </w:tcBorders>
+            <w:tcW w:type="dxa" w:w="3118"/>
           </w:tcPr>
           <w:p>
-            <w:r/>
+            <w:pPr>
+              <w:spacing w:before="40" w:after="40"/>
+            </w:pPr>
+            <w:r>
+              <w:rPr>
+                <w:rFonts w:ascii="Times New Roman" w:hAnsi="Times New Roman"/>
+                <w:b w:val="0"/>
+                <w:sz w:val="24"/>
+              </w:rPr>
+              <w:t xml:space="preserve">. . . . . . . . . . . . . . . . </w:t>
+            </w:r>
           </w:p>
         </w:tc>
         <w:tc>
           <w:tcPr>
-            <w:tcW w:type="dxa" w:w="907"/>
+            <w:tcW w:type="dxa" w:w="1020"/>
           </w:tcPr>
           <w:p>
             <w:pPr>
+              <w:spacing w:before="40" w:after="40"/>
               <w:jc w:val="right"/>
             </w:pPr>
             <w:r>
@@ -3523,11 +3827,11 @@
       <w:tr>
         <w:tc>
           <w:tcPr>
-            <w:tcW w:type="dxa" w:w="6236"/>
+            <w:tcW w:type="dxa" w:w="5386"/>
           </w:tcPr>
           <w:p>
             <w:pPr>
-              <w:spacing w:before="20" w:after="20"/>
+              <w:spacing w:before="40" w:after="40" w:line="276" w:lineRule="auto"/>
               <w:ind w:left="283"/>
             </w:pPr>
             <w:r>
@@ -3550,24 +3854,29 @@
         </w:tc>
         <w:tc>
           <w:tcPr>
-            <w:tcW w:type="dxa" w:w="2835"/>
-            <w:tcBorders>
-              <w:top w:val="nil"/>
-              <w:left w:val="nil"/>
-              <w:right w:val="nil"/>
-              <w:bottom w:val="dotted" w:sz="12" w:space="1" w:color="000000"/>
-            </w:tcBorders>
+            <w:tcW w:type="dxa" w:w="3118"/>
           </w:tcPr>
           <w:p>
-            <w:r/>
+            <w:pPr>
+              <w:spacing w:before="40" w:after="40"/>
+            </w:pPr>
+            <w:r>
+              <w:rPr>
+                <w:rFonts w:ascii="Times New Roman" w:hAnsi="Times New Roman"/>
+                <w:b w:val="0"/>
+                <w:sz w:val="24"/>
+              </w:rPr>
+              <w:t xml:space="preserve">. . . . . . . . . . . . . . . . </w:t>
+            </w:r>
           </w:p>
         </w:tc>
         <w:tc>
           <w:tcPr>
-            <w:tcW w:type="dxa" w:w="907"/>
+            <w:tcW w:type="dxa" w:w="1020"/>
           </w:tcPr>
           <w:p>
             <w:pPr>
+              <w:spacing w:before="40" w:after="40"/>
               <w:jc w:val="right"/>
             </w:pPr>
             <w:r>
@@ -3584,11 +3893,11 @@
       <w:tr>
         <w:tc>
           <w:tcPr>
-            <w:tcW w:type="dxa" w:w="6236"/>
+            <w:tcW w:type="dxa" w:w="5386"/>
           </w:tcPr>
           <w:p>
             <w:pPr>
-              <w:spacing w:before="20" w:after="20"/>
+              <w:spacing w:before="40" w:after="40" w:line="276" w:lineRule="auto"/>
               <w:ind w:left="283"/>
             </w:pPr>
             <w:r>
@@ -3611,24 +3920,29 @@
         </w:tc>
         <w:tc>
           <w:tcPr>
-            <w:tcW w:type="dxa" w:w="2835"/>
-            <w:tcBorders>
-              <w:top w:val="nil"/>
-              <w:left w:val="nil"/>
-              <w:right w:val="nil"/>
-              <w:bottom w:val="dotted" w:sz="12" w:space="1" w:color="000000"/>
-            </w:tcBorders>
+            <w:tcW w:type="dxa" w:w="3118"/>
           </w:tcPr>
           <w:p>
-            <w:r/>
+            <w:pPr>
+              <w:spacing w:before="40" w:after="40"/>
+            </w:pPr>
+            <w:r>
+              <w:rPr>
+                <w:rFonts w:ascii="Times New Roman" w:hAnsi="Times New Roman"/>
+                <w:b w:val="0"/>
+                <w:sz w:val="24"/>
+              </w:rPr>
+              <w:t xml:space="preserve">. . . . . . . . . . . . . . . . </w:t>
+            </w:r>
           </w:p>
         </w:tc>
         <w:tc>
           <w:tcPr>
-            <w:tcW w:type="dxa" w:w="907"/>
+            <w:tcW w:type="dxa" w:w="1020"/>
           </w:tcPr>
           <w:p>
             <w:pPr>
+              <w:spacing w:before="40" w:after="40"/>
               <w:jc w:val="right"/>
             </w:pPr>
             <w:r>
@@ -3645,11 +3959,11 @@
       <w:tr>
         <w:tc>
           <w:tcPr>
-            <w:tcW w:type="dxa" w:w="6236"/>
+            <w:tcW w:type="dxa" w:w="5386"/>
           </w:tcPr>
           <w:p>
             <w:pPr>
-              <w:spacing w:before="20" w:after="20"/>
+              <w:spacing w:before="40" w:after="40" w:line="276" w:lineRule="auto"/>
               <w:ind w:left="283"/>
             </w:pPr>
             <w:r>
@@ -3672,24 +3986,29 @@
         </w:tc>
         <w:tc>
           <w:tcPr>
-            <w:tcW w:type="dxa" w:w="2835"/>
-            <w:tcBorders>
-              <w:top w:val="nil"/>
-              <w:left w:val="nil"/>
-              <w:right w:val="nil"/>
-              <w:bottom w:val="dotted" w:sz="12" w:space="1" w:color="000000"/>
-            </w:tcBorders>
+            <w:tcW w:type="dxa" w:w="3118"/>
           </w:tcPr>
           <w:p>
-            <w:r/>
+            <w:pPr>
+              <w:spacing w:before="40" w:after="40"/>
+            </w:pPr>
+            <w:r>
+              <w:rPr>
+                <w:rFonts w:ascii="Times New Roman" w:hAnsi="Times New Roman"/>
+                <w:b w:val="0"/>
+                <w:sz w:val="24"/>
+              </w:rPr>
+              <w:t xml:space="preserve">. . . . . . . . . . . . . . . . </w:t>
+            </w:r>
           </w:p>
         </w:tc>
         <w:tc>
           <w:tcPr>
-            <w:tcW w:type="dxa" w:w="907"/>
+            <w:tcW w:type="dxa" w:w="1020"/>
           </w:tcPr>
           <w:p>
             <w:pPr>
+              <w:spacing w:before="40" w:after="40"/>
               <w:jc w:val="right"/>
             </w:pPr>
             <w:r>
@@ -3706,11 +4025,11 @@
       <w:tr>
         <w:tc>
           <w:tcPr>
-            <w:tcW w:type="dxa" w:w="6236"/>
+            <w:tcW w:type="dxa" w:w="5386"/>
           </w:tcPr>
           <w:p>
             <w:pPr>
-              <w:spacing w:before="20" w:after="20"/>
+              <w:spacing w:before="40" w:after="40" w:line="276" w:lineRule="auto"/>
               <w:ind w:left="283"/>
             </w:pPr>
             <w:r>
@@ -3733,24 +4052,29 @@
         </w:tc>
         <w:tc>
           <w:tcPr>
-            <w:tcW w:type="dxa" w:w="2835"/>
-            <w:tcBorders>
-              <w:top w:val="nil"/>
-              <w:left w:val="nil"/>
-              <w:right w:val="nil"/>
-              <w:bottom w:val="dotted" w:sz="12" w:space="1" w:color="000000"/>
-            </w:tcBorders>
+            <w:tcW w:type="dxa" w:w="3118"/>
           </w:tcPr>
           <w:p>
-            <w:r/>
+            <w:pPr>
+              <w:spacing w:before="40" w:after="40"/>
+            </w:pPr>
+            <w:r>
+              <w:rPr>
+                <w:rFonts w:ascii="Times New Roman" w:hAnsi="Times New Roman"/>
+                <w:b w:val="0"/>
+                <w:sz w:val="24"/>
+              </w:rPr>
+              <w:t xml:space="preserve">. . . . . . . . . . . . . . . . </w:t>
+            </w:r>
           </w:p>
         </w:tc>
         <w:tc>
           <w:tcPr>
-            <w:tcW w:type="dxa" w:w="907"/>
+            <w:tcW w:type="dxa" w:w="1020"/>
           </w:tcPr>
           <w:p>
             <w:pPr>
+              <w:spacing w:before="40" w:after="40"/>
               <w:jc w:val="right"/>
             </w:pPr>
             <w:r>
@@ -3767,11 +4091,11 @@
       <w:tr>
         <w:tc>
           <w:tcPr>
-            <w:tcW w:type="dxa" w:w="6236"/>
+            <w:tcW w:type="dxa" w:w="5386"/>
           </w:tcPr>
           <w:p>
             <w:pPr>
-              <w:spacing w:before="20" w:after="20"/>
+              <w:spacing w:before="40" w:after="40" w:line="276" w:lineRule="auto"/>
               <w:ind w:left="283"/>
             </w:pPr>
             <w:r>
@@ -3794,24 +4118,29 @@
         </w:tc>
         <w:tc>
           <w:tcPr>
-            <w:tcW w:type="dxa" w:w="2835"/>
-            <w:tcBorders>
-              <w:top w:val="nil"/>
-              <w:left w:val="nil"/>
-              <w:right w:val="nil"/>
-              <w:bottom w:val="dotted" w:sz="12" w:space="1" w:color="000000"/>
-            </w:tcBorders>
+            <w:tcW w:type="dxa" w:w="3118"/>
           </w:tcPr>
           <w:p>
-            <w:r/>
+            <w:pPr>
+              <w:spacing w:before="40" w:after="40"/>
+            </w:pPr>
+            <w:r>
+              <w:rPr>
+                <w:rFonts w:ascii="Times New Roman" w:hAnsi="Times New Roman"/>
+                <w:b w:val="0"/>
+                <w:sz w:val="24"/>
+              </w:rPr>
+              <w:t xml:space="preserve">. . . . . . . . . . . . . . . . </w:t>
+            </w:r>
           </w:p>
         </w:tc>
         <w:tc>
           <w:tcPr>
-            <w:tcW w:type="dxa" w:w="907"/>
+            <w:tcW w:type="dxa" w:w="1020"/>
           </w:tcPr>
           <w:p>
             <w:pPr>
+              <w:spacing w:before="40" w:after="40"/>
               <w:jc w:val="right"/>
             </w:pPr>
             <w:r>
@@ -3828,11 +4157,11 @@
       <w:tr>
         <w:tc>
           <w:tcPr>
-            <w:tcW w:type="dxa" w:w="6236"/>
+            <w:tcW w:type="dxa" w:w="5386"/>
           </w:tcPr>
           <w:p>
             <w:pPr>
-              <w:spacing w:before="20" w:after="20"/>
+              <w:spacing w:before="40" w:after="40" w:line="276" w:lineRule="auto"/>
               <w:ind w:left="283"/>
             </w:pPr>
             <w:r>
@@ -3855,24 +4184,29 @@
         </w:tc>
         <w:tc>
           <w:tcPr>
-            <w:tcW w:type="dxa" w:w="2835"/>
-            <w:tcBorders>
-              <w:top w:val="nil"/>
-              <w:left w:val="nil"/>
-              <w:right w:val="nil"/>
-              <w:bottom w:val="dotted" w:sz="12" w:space="1" w:color="000000"/>
-            </w:tcBorders>
+            <w:tcW w:type="dxa" w:w="3118"/>
           </w:tcPr>
           <w:p>
-            <w:r/>
+            <w:pPr>
+              <w:spacing w:before="40" w:after="40"/>
+            </w:pPr>
+            <w:r>
+              <w:rPr>
+                <w:rFonts w:ascii="Times New Roman" w:hAnsi="Times New Roman"/>
+                <w:b w:val="0"/>
+                <w:sz w:val="24"/>
+              </w:rPr>
+              <w:t xml:space="preserve">. . . . . . . . . . . . . . . . </w:t>
+            </w:r>
           </w:p>
         </w:tc>
         <w:tc>
           <w:tcPr>
-            <w:tcW w:type="dxa" w:w="907"/>
+            <w:tcW w:type="dxa" w:w="1020"/>
           </w:tcPr>
           <w:p>
             <w:pPr>
+              <w:spacing w:before="40" w:after="40"/>
               <w:jc w:val="right"/>
             </w:pPr>
             <w:r>
@@ -3889,11 +4223,11 @@
       <w:tr>
         <w:tc>
           <w:tcPr>
-            <w:tcW w:type="dxa" w:w="6236"/>
+            <w:tcW w:type="dxa" w:w="5386"/>
           </w:tcPr>
           <w:p>
             <w:pPr>
-              <w:spacing w:before="20" w:after="20"/>
+              <w:spacing w:before="40" w:after="40" w:line="276" w:lineRule="auto"/>
               <w:ind w:left="283"/>
             </w:pPr>
             <w:r>
@@ -3916,24 +4250,29 @@
         </w:tc>
         <w:tc>
           <w:tcPr>
-            <w:tcW w:type="dxa" w:w="2835"/>
-            <w:tcBorders>
-              <w:top w:val="nil"/>
-              <w:left w:val="nil"/>
-              <w:right w:val="nil"/>
-              <w:bottom w:val="dotted" w:sz="12" w:space="1" w:color="000000"/>
-            </w:tcBorders>
+            <w:tcW w:type="dxa" w:w="3118"/>
           </w:tcPr>
           <w:p>
-            <w:r/>
+            <w:pPr>
+              <w:spacing w:before="40" w:after="40"/>
+            </w:pPr>
+            <w:r>
+              <w:rPr>
+                <w:rFonts w:ascii="Times New Roman" w:hAnsi="Times New Roman"/>
+                <w:b w:val="0"/>
+                <w:sz w:val="24"/>
+              </w:rPr>
+              <w:t xml:space="preserve">. . . . . . . . . . . . . . . . </w:t>
+            </w:r>
           </w:p>
         </w:tc>
         <w:tc>
           <w:tcPr>
-            <w:tcW w:type="dxa" w:w="907"/>
+            <w:tcW w:type="dxa" w:w="1020"/>
           </w:tcPr>
           <w:p>
             <w:pPr>
+              <w:spacing w:before="40" w:after="40"/>
               <w:jc w:val="right"/>
             </w:pPr>
             <w:r>
@@ -3950,11 +4289,11 @@
       <w:tr>
         <w:tc>
           <w:tcPr>
-            <w:tcW w:type="dxa" w:w="6236"/>
+            <w:tcW w:type="dxa" w:w="5386"/>
           </w:tcPr>
           <w:p>
             <w:pPr>
-              <w:spacing w:before="20" w:after="20"/>
+              <w:spacing w:before="40" w:after="40" w:line="276" w:lineRule="auto"/>
               <w:ind w:left="283"/>
             </w:pPr>
             <w:r>
@@ -3977,24 +4316,29 @@
         </w:tc>
         <w:tc>
           <w:tcPr>
-            <w:tcW w:type="dxa" w:w="2835"/>
-            <w:tcBorders>
-              <w:top w:val="nil"/>
-              <w:left w:val="nil"/>
-              <w:right w:val="nil"/>
-              <w:bottom w:val="dotted" w:sz="12" w:space="1" w:color="000000"/>
-            </w:tcBorders>
+            <w:tcW w:type="dxa" w:w="3118"/>
           </w:tcPr>
           <w:p>
-            <w:r/>
+            <w:pPr>
+              <w:spacing w:before="40" w:after="40"/>
+            </w:pPr>
+            <w:r>
+              <w:rPr>
+                <w:rFonts w:ascii="Times New Roman" w:hAnsi="Times New Roman"/>
+                <w:b w:val="0"/>
+                <w:sz w:val="24"/>
+              </w:rPr>
+              <w:t xml:space="preserve">. . . . . . . . . . . . . . . . </w:t>
+            </w:r>
           </w:p>
         </w:tc>
         <w:tc>
           <w:tcPr>
-            <w:tcW w:type="dxa" w:w="907"/>
+            <w:tcW w:type="dxa" w:w="1020"/>
           </w:tcPr>
           <w:p>
             <w:pPr>
+              <w:spacing w:before="40" w:after="40"/>
               <w:jc w:val="right"/>
             </w:pPr>
             <w:r>
@@ -4011,11 +4355,11 @@
       <w:tr>
         <w:tc>
           <w:tcPr>
-            <w:tcW w:type="dxa" w:w="6236"/>
+            <w:tcW w:type="dxa" w:w="5386"/>
           </w:tcPr>
           <w:p>
             <w:pPr>
-              <w:spacing w:before="20" w:after="20"/>
+              <w:spacing w:before="40" w:after="40" w:line="276" w:lineRule="auto"/>
             </w:pPr>
             <w:r>
               <w:rPr>
@@ -4029,24 +4373,29 @@
         </w:tc>
         <w:tc>
           <w:tcPr>
-            <w:tcW w:type="dxa" w:w="2835"/>
-            <w:tcBorders>
-              <w:top w:val="nil"/>
-              <w:left w:val="nil"/>
-              <w:right w:val="nil"/>
-              <w:bottom w:val="dotted" w:sz="12" w:space="1" w:color="000000"/>
-            </w:tcBorders>
+            <w:tcW w:type="dxa" w:w="3118"/>
           </w:tcPr>
           <w:p>
-            <w:r/>
+            <w:pPr>
+              <w:spacing w:before="40" w:after="40"/>
+            </w:pPr>
+            <w:r>
+              <w:rPr>
+                <w:rFonts w:ascii="Times New Roman" w:hAnsi="Times New Roman"/>
+                <w:b w:val="0"/>
+                <w:sz w:val="24"/>
+              </w:rPr>
+              <w:t xml:space="preserve">. . . . . . . . . . . . . . . . </w:t>
+            </w:r>
           </w:p>
         </w:tc>
         <w:tc>
           <w:tcPr>
-            <w:tcW w:type="dxa" w:w="907"/>
+            <w:tcW w:type="dxa" w:w="1020"/>
           </w:tcPr>
           <w:p>
             <w:pPr>
+              <w:spacing w:before="40" w:after="40"/>
               <w:jc w:val="right"/>
             </w:pPr>
             <w:r>
@@ -4063,11 +4412,11 @@
       <w:tr>
         <w:tc>
           <w:tcPr>
-            <w:tcW w:type="dxa" w:w="6236"/>
+            <w:tcW w:type="dxa" w:w="5386"/>
           </w:tcPr>
           <w:p>
             <w:pPr>
-              <w:spacing w:before="20" w:after="20"/>
+              <w:spacing w:before="40" w:after="40" w:line="276" w:lineRule="auto"/>
               <w:ind w:left="283"/>
             </w:pPr>
             <w:r>
@@ -4090,24 +4439,29 @@
         </w:tc>
         <w:tc>
           <w:tcPr>
-            <w:tcW w:type="dxa" w:w="2835"/>
-            <w:tcBorders>
-              <w:top w:val="nil"/>
-              <w:left w:val="nil"/>
-              <w:right w:val="nil"/>
-              <w:bottom w:val="dotted" w:sz="12" w:space="1" w:color="000000"/>
-            </w:tcBorders>
+            <w:tcW w:type="dxa" w:w="3118"/>
           </w:tcPr>
           <w:p>
-            <w:r/>
+            <w:pPr>
+              <w:spacing w:before="40" w:after="40"/>
+            </w:pPr>
+            <w:r>
+              <w:rPr>
+                <w:rFonts w:ascii="Times New Roman" w:hAnsi="Times New Roman"/>
+                <w:b w:val="0"/>
+                <w:sz w:val="24"/>
+              </w:rPr>
+              <w:t xml:space="preserve">. . . . . . . . . . . . . . . . </w:t>
+            </w:r>
           </w:p>
         </w:tc>
         <w:tc>
           <w:tcPr>
-            <w:tcW w:type="dxa" w:w="907"/>
+            <w:tcW w:type="dxa" w:w="1020"/>
           </w:tcPr>
           <w:p>
             <w:pPr>
+              <w:spacing w:before="40" w:after="40"/>
               <w:jc w:val="right"/>
             </w:pPr>
             <w:r>
@@ -4124,11 +4478,11 @@
       <w:tr>
         <w:tc>
           <w:tcPr>
-            <w:tcW w:type="dxa" w:w="6236"/>
+            <w:tcW w:type="dxa" w:w="5386"/>
           </w:tcPr>
           <w:p>
             <w:pPr>
-              <w:spacing w:before="20" w:after="20"/>
+              <w:spacing w:before="40" w:after="40" w:line="276" w:lineRule="auto"/>
               <w:ind w:left="283"/>
             </w:pPr>
             <w:r>
@@ -4151,24 +4505,29 @@
         </w:tc>
         <w:tc>
           <w:tcPr>
-            <w:tcW w:type="dxa" w:w="2835"/>
-            <w:tcBorders>
-              <w:top w:val="nil"/>
-              <w:left w:val="nil"/>
-              <w:right w:val="nil"/>
-              <w:bottom w:val="dotted" w:sz="12" w:space="1" w:color="000000"/>
-            </w:tcBorders>
+            <w:tcW w:type="dxa" w:w="3118"/>
           </w:tcPr>
           <w:p>
-            <w:r/>
+            <w:pPr>
+              <w:spacing w:before="40" w:after="40"/>
+            </w:pPr>
+            <w:r>
+              <w:rPr>
+                <w:rFonts w:ascii="Times New Roman" w:hAnsi="Times New Roman"/>
+                <w:b w:val="0"/>
+                <w:sz w:val="24"/>
+              </w:rPr>
+              <w:t xml:space="preserve">. . . . . . . . . . . . . . . . </w:t>
+            </w:r>
           </w:p>
         </w:tc>
         <w:tc>
           <w:tcPr>
-            <w:tcW w:type="dxa" w:w="907"/>
+            <w:tcW w:type="dxa" w:w="1020"/>
           </w:tcPr>
           <w:p>
             <w:pPr>
+              <w:spacing w:before="40" w:after="40"/>
               <w:jc w:val="right"/>
             </w:pPr>
             <w:r>
@@ -4185,11 +4544,11 @@
       <w:tr>
         <w:tc>
           <w:tcPr>
-            <w:tcW w:type="dxa" w:w="6236"/>
+            <w:tcW w:type="dxa" w:w="5386"/>
           </w:tcPr>
           <w:p>
             <w:pPr>
-              <w:spacing w:before="20" w:after="20"/>
+              <w:spacing w:before="40" w:after="40" w:line="276" w:lineRule="auto"/>
               <w:ind w:left="283"/>
             </w:pPr>
             <w:r>
@@ -4212,24 +4571,29 @@
         </w:tc>
         <w:tc>
           <w:tcPr>
-            <w:tcW w:type="dxa" w:w="2835"/>
-            <w:tcBorders>
-              <w:top w:val="nil"/>
-              <w:left w:val="nil"/>
-              <w:right w:val="nil"/>
-              <w:bottom w:val="dotted" w:sz="12" w:space="1" w:color="000000"/>
-            </w:tcBorders>
+            <w:tcW w:type="dxa" w:w="3118"/>
           </w:tcPr>
           <w:p>
-            <w:r/>
+            <w:pPr>
+              <w:spacing w:before="40" w:after="40"/>
+            </w:pPr>
+            <w:r>
+              <w:rPr>
+                <w:rFonts w:ascii="Times New Roman" w:hAnsi="Times New Roman"/>
+                <w:b w:val="0"/>
+                <w:sz w:val="24"/>
+              </w:rPr>
+              <w:t xml:space="preserve">. . . . . . . . . . . . . . . . </w:t>
+            </w:r>
           </w:p>
         </w:tc>
         <w:tc>
           <w:tcPr>
-            <w:tcW w:type="dxa" w:w="907"/>
+            <w:tcW w:type="dxa" w:w="1020"/>
           </w:tcPr>
           <w:p>
             <w:pPr>
+              <w:spacing w:before="40" w:after="40"/>
               <w:jc w:val="right"/>
             </w:pPr>
             <w:r>
@@ -4246,11 +4610,11 @@
       <w:tr>
         <w:tc>
           <w:tcPr>
-            <w:tcW w:type="dxa" w:w="6236"/>
+            <w:tcW w:type="dxa" w:w="5386"/>
           </w:tcPr>
           <w:p>
             <w:pPr>
-              <w:spacing w:before="20" w:after="20"/>
+              <w:spacing w:before="40" w:after="40" w:line="276" w:lineRule="auto"/>
               <w:ind w:left="283"/>
             </w:pPr>
             <w:r>
@@ -4273,24 +4637,29 @@
         </w:tc>
         <w:tc>
           <w:tcPr>
-            <w:tcW w:type="dxa" w:w="2835"/>
-            <w:tcBorders>
-              <w:top w:val="nil"/>
-              <w:left w:val="nil"/>
-              <w:right w:val="nil"/>
-              <w:bottom w:val="dotted" w:sz="12" w:space="1" w:color="000000"/>
-            </w:tcBorders>
+            <w:tcW w:type="dxa" w:w="3118"/>
           </w:tcPr>
           <w:p>
-            <w:r/>
+            <w:pPr>
+              <w:spacing w:before="40" w:after="40"/>
+            </w:pPr>
+            <w:r>
+              <w:rPr>
+                <w:rFonts w:ascii="Times New Roman" w:hAnsi="Times New Roman"/>
+                <w:b w:val="0"/>
+                <w:sz w:val="24"/>
+              </w:rPr>
+              <w:t xml:space="preserve">. . . . . . . . . . . . . . . . </w:t>
+            </w:r>
           </w:p>
         </w:tc>
         <w:tc>
           <w:tcPr>
-            <w:tcW w:type="dxa" w:w="907"/>
+            <w:tcW w:type="dxa" w:w="1020"/>
           </w:tcPr>
           <w:p>
             <w:pPr>
+              <w:spacing w:before="40" w:after="40"/>
               <w:jc w:val="right"/>
             </w:pPr>
             <w:r>
@@ -4307,11 +4676,11 @@
       <w:tr>
         <w:tc>
           <w:tcPr>
-            <w:tcW w:type="dxa" w:w="6236"/>
+            <w:tcW w:type="dxa" w:w="5386"/>
           </w:tcPr>
           <w:p>
             <w:pPr>
-              <w:spacing w:before="20" w:after="20"/>
+              <w:spacing w:before="40" w:after="40" w:line="276" w:lineRule="auto"/>
               <w:ind w:left="283"/>
             </w:pPr>
             <w:r>
@@ -4334,24 +4703,29 @@
         </w:tc>
         <w:tc>
           <w:tcPr>
-            <w:tcW w:type="dxa" w:w="2835"/>
-            <w:tcBorders>
-              <w:top w:val="nil"/>
-              <w:left w:val="nil"/>
-              <w:right w:val="nil"/>
-              <w:bottom w:val="dotted" w:sz="12" w:space="1" w:color="000000"/>
-            </w:tcBorders>
+            <w:tcW w:type="dxa" w:w="3118"/>
           </w:tcPr>
           <w:p>
-            <w:r/>
+            <w:pPr>
+              <w:spacing w:before="40" w:after="40"/>
+            </w:pPr>
+            <w:r>
+              <w:rPr>
+                <w:rFonts w:ascii="Times New Roman" w:hAnsi="Times New Roman"/>
+                <w:b w:val="0"/>
+                <w:sz w:val="24"/>
+              </w:rPr>
+              <w:t xml:space="preserve">. . . . . . . . . . . . . . . . </w:t>
+            </w:r>
           </w:p>
         </w:tc>
         <w:tc>
           <w:tcPr>
-            <w:tcW w:type="dxa" w:w="907"/>
+            <w:tcW w:type="dxa" w:w="1020"/>
           </w:tcPr>
           <w:p>
             <w:pPr>
+              <w:spacing w:before="40" w:after="40"/>
               <w:jc w:val="right"/>
             </w:pPr>
             <w:r>
@@ -4368,11 +4742,11 @@
       <w:tr>
         <w:tc>
           <w:tcPr>
-            <w:tcW w:type="dxa" w:w="6236"/>
+            <w:tcW w:type="dxa" w:w="5386"/>
           </w:tcPr>
           <w:p>
             <w:pPr>
-              <w:spacing w:before="20" w:after="20"/>
+              <w:spacing w:before="40" w:after="40" w:line="276" w:lineRule="auto"/>
               <w:ind w:left="283"/>
             </w:pPr>
             <w:r>
@@ -4395,24 +4769,29 @@
         </w:tc>
         <w:tc>
           <w:tcPr>
-            <w:tcW w:type="dxa" w:w="2835"/>
-            <w:tcBorders>
-              <w:top w:val="nil"/>
-              <w:left w:val="nil"/>
-              <w:right w:val="nil"/>
-              <w:bottom w:val="dotted" w:sz="12" w:space="1" w:color="000000"/>
-            </w:tcBorders>
+            <w:tcW w:type="dxa" w:w="3118"/>
           </w:tcPr>
           <w:p>
-            <w:r/>
+            <w:pPr>
+              <w:spacing w:before="40" w:after="40"/>
+            </w:pPr>
+            <w:r>
+              <w:rPr>
+                <w:rFonts w:ascii="Times New Roman" w:hAnsi="Times New Roman"/>
+                <w:b w:val="0"/>
+                <w:sz w:val="24"/>
+              </w:rPr>
+              <w:t xml:space="preserve">. . . . . . . . . . . . . . . . </w:t>
+            </w:r>
           </w:p>
         </w:tc>
         <w:tc>
           <w:tcPr>
-            <w:tcW w:type="dxa" w:w="907"/>
+            <w:tcW w:type="dxa" w:w="1020"/>
           </w:tcPr>
           <w:p>
             <w:pPr>
+              <w:spacing w:before="40" w:after="40"/>
               <w:jc w:val="right"/>
             </w:pPr>
             <w:r>
@@ -4429,11 +4808,11 @@
       <w:tr>
         <w:tc>
           <w:tcPr>
-            <w:tcW w:type="dxa" w:w="6236"/>
+            <w:tcW w:type="dxa" w:w="5386"/>
           </w:tcPr>
           <w:p>
             <w:pPr>
-              <w:spacing w:before="20" w:after="20"/>
+              <w:spacing w:before="40" w:after="40" w:line="276" w:lineRule="auto"/>
               <w:ind w:left="283"/>
             </w:pPr>
             <w:r>
@@ -4456,24 +4835,29 @@
         </w:tc>
         <w:tc>
           <w:tcPr>
-            <w:tcW w:type="dxa" w:w="2835"/>
-            <w:tcBorders>
-              <w:top w:val="nil"/>
-              <w:left w:val="nil"/>
-              <w:right w:val="nil"/>
-              <w:bottom w:val="dotted" w:sz="12" w:space="1" w:color="000000"/>
-            </w:tcBorders>
+            <w:tcW w:type="dxa" w:w="3118"/>
           </w:tcPr>
           <w:p>
-            <w:r/>
+            <w:pPr>
+              <w:spacing w:before="40" w:after="40"/>
+            </w:pPr>
+            <w:r>
+              <w:rPr>
+                <w:rFonts w:ascii="Times New Roman" w:hAnsi="Times New Roman"/>
+                <w:b w:val="0"/>
+                <w:sz w:val="24"/>
+              </w:rPr>
+              <w:t xml:space="preserve">. . . . . . . . . . . . . . . . </w:t>
+            </w:r>
           </w:p>
         </w:tc>
         <w:tc>
           <w:tcPr>
-            <w:tcW w:type="dxa" w:w="907"/>
+            <w:tcW w:type="dxa" w:w="1020"/>
           </w:tcPr>
           <w:p>
             <w:pPr>
+              <w:spacing w:before="40" w:after="40"/>
               <w:jc w:val="right"/>
             </w:pPr>
             <w:r>
@@ -4490,11 +4874,11 @@
       <w:tr>
         <w:tc>
           <w:tcPr>
-            <w:tcW w:type="dxa" w:w="6236"/>
+            <w:tcW w:type="dxa" w:w="5386"/>
           </w:tcPr>
           <w:p>
             <w:pPr>
-              <w:spacing w:before="20" w:after="20"/>
+              <w:spacing w:before="40" w:after="40" w:line="276" w:lineRule="auto"/>
               <w:ind w:left="283"/>
             </w:pPr>
             <w:r>
@@ -4517,24 +4901,29 @@
         </w:tc>
         <w:tc>
           <w:tcPr>
-            <w:tcW w:type="dxa" w:w="2835"/>
-            <w:tcBorders>
-              <w:top w:val="nil"/>
-              <w:left w:val="nil"/>
-              <w:right w:val="nil"/>
-              <w:bottom w:val="dotted" w:sz="12" w:space="1" w:color="000000"/>
-            </w:tcBorders>
+            <w:tcW w:type="dxa" w:w="3118"/>
           </w:tcPr>
           <w:p>
-            <w:r/>
+            <w:pPr>
+              <w:spacing w:before="40" w:after="40"/>
+            </w:pPr>
+            <w:r>
+              <w:rPr>
+                <w:rFonts w:ascii="Times New Roman" w:hAnsi="Times New Roman"/>
+                <w:b w:val="0"/>
+                <w:sz w:val="24"/>
+              </w:rPr>
+              <w:t xml:space="preserve">. . . . . . . . . . . . . . . . </w:t>
+            </w:r>
           </w:p>
         </w:tc>
         <w:tc>
           <w:tcPr>
-            <w:tcW w:type="dxa" w:w="907"/>
+            <w:tcW w:type="dxa" w:w="1020"/>
           </w:tcPr>
           <w:p>
             <w:pPr>
+              <w:spacing w:before="40" w:after="40"/>
               <w:jc w:val="right"/>
             </w:pPr>
             <w:r>
@@ -4551,11 +4940,11 @@
       <w:tr>
         <w:tc>
           <w:tcPr>
-            <w:tcW w:type="dxa" w:w="6236"/>
+            <w:tcW w:type="dxa" w:w="5386"/>
           </w:tcPr>
           <w:p>
             <w:pPr>
-              <w:spacing w:before="20" w:after="20"/>
+              <w:spacing w:before="40" w:after="40" w:line="276" w:lineRule="auto"/>
               <w:ind w:left="283"/>
             </w:pPr>
             <w:r>
@@ -4578,24 +4967,29 @@
         </w:tc>
         <w:tc>
           <w:tcPr>
-            <w:tcW w:type="dxa" w:w="2835"/>
-            <w:tcBorders>
-              <w:top w:val="nil"/>
-              <w:left w:val="nil"/>
-              <w:right w:val="nil"/>
-              <w:bottom w:val="dotted" w:sz="12" w:space="1" w:color="000000"/>
-            </w:tcBorders>
+            <w:tcW w:type="dxa" w:w="3118"/>
           </w:tcPr>
           <w:p>
-            <w:r/>
+            <w:pPr>
+              <w:spacing w:before="40" w:after="40"/>
+            </w:pPr>
+            <w:r>
+              <w:rPr>
+                <w:rFonts w:ascii="Times New Roman" w:hAnsi="Times New Roman"/>
+                <w:b w:val="0"/>
+                <w:sz w:val="24"/>
+              </w:rPr>
+              <w:t xml:space="preserve">. . . . . . . . . . . . . . . . </w:t>
+            </w:r>
           </w:p>
         </w:tc>
         <w:tc>
           <w:tcPr>
-            <w:tcW w:type="dxa" w:w="907"/>
+            <w:tcW w:type="dxa" w:w="1020"/>
           </w:tcPr>
           <w:p>
             <w:pPr>
+              <w:spacing w:before="40" w:after="40"/>
               <w:jc w:val="right"/>
             </w:pPr>
             <w:r>
@@ -4612,11 +5006,11 @@
       <w:tr>
         <w:tc>
           <w:tcPr>
-            <w:tcW w:type="dxa" w:w="6236"/>
+            <w:tcW w:type="dxa" w:w="5386"/>
           </w:tcPr>
           <w:p>
             <w:pPr>
-              <w:spacing w:before="20" w:after="20"/>
+              <w:spacing w:before="40" w:after="40" w:line="276" w:lineRule="auto"/>
             </w:pPr>
             <w:r>
               <w:rPr>
@@ -4630,24 +5024,29 @@
         </w:tc>
         <w:tc>
           <w:tcPr>
-            <w:tcW w:type="dxa" w:w="2835"/>
-            <w:tcBorders>
-              <w:top w:val="nil"/>
-              <w:left w:val="nil"/>
-              <w:right w:val="nil"/>
-              <w:bottom w:val="dotted" w:sz="12" w:space="1" w:color="000000"/>
-            </w:tcBorders>
+            <w:tcW w:type="dxa" w:w="3118"/>
           </w:tcPr>
           <w:p>
-            <w:r/>
+            <w:pPr>
+              <w:spacing w:before="40" w:after="40"/>
+            </w:pPr>
+            <w:r>
+              <w:rPr>
+                <w:rFonts w:ascii="Times New Roman" w:hAnsi="Times New Roman"/>
+                <w:b w:val="0"/>
+                <w:sz w:val="24"/>
+              </w:rPr>
+              <w:t xml:space="preserve">. . . . . . . . . . . . . . . . </w:t>
+            </w:r>
           </w:p>
         </w:tc>
         <w:tc>
           <w:tcPr>
-            <w:tcW w:type="dxa" w:w="907"/>
+            <w:tcW w:type="dxa" w:w="1020"/>
           </w:tcPr>
           <w:p>
             <w:pPr>
+              <w:spacing w:before="40" w:after="40"/>
               <w:jc w:val="right"/>
             </w:pPr>
             <w:r>
@@ -4664,11 +5063,11 @@
       <w:tr>
         <w:tc>
           <w:tcPr>
-            <w:tcW w:type="dxa" w:w="6236"/>
+            <w:tcW w:type="dxa" w:w="5386"/>
           </w:tcPr>
           <w:p>
             <w:pPr>
-              <w:spacing w:before="20" w:after="20"/>
+              <w:spacing w:before="40" w:after="40" w:line="276" w:lineRule="auto"/>
               <w:ind w:left="283"/>
             </w:pPr>
             <w:r>
@@ -4691,24 +5090,29 @@
         </w:tc>
         <w:tc>
           <w:tcPr>
-            <w:tcW w:type="dxa" w:w="2835"/>
-            <w:tcBorders>
-              <w:top w:val="nil"/>
-              <w:left w:val="nil"/>
-              <w:right w:val="nil"/>
-              <w:bottom w:val="dotted" w:sz="12" w:space="1" w:color="000000"/>
-            </w:tcBorders>
+            <w:tcW w:type="dxa" w:w="3118"/>
           </w:tcPr>
           <w:p>
-            <w:r/>
+            <w:pPr>
+              <w:spacing w:before="40" w:after="40"/>
+            </w:pPr>
+            <w:r>
+              <w:rPr>
+                <w:rFonts w:ascii="Times New Roman" w:hAnsi="Times New Roman"/>
+                <w:b w:val="0"/>
+                <w:sz w:val="24"/>
+              </w:rPr>
+              <w:t xml:space="preserve">. . . . . . . . . . . . . . . . </w:t>
+            </w:r>
           </w:p>
         </w:tc>
         <w:tc>
           <w:tcPr>
-            <w:tcW w:type="dxa" w:w="907"/>
+            <w:tcW w:type="dxa" w:w="1020"/>
           </w:tcPr>
           <w:p>
             <w:pPr>
+              <w:spacing w:before="40" w:after="40"/>
               <w:jc w:val="right"/>
             </w:pPr>
             <w:r>
@@ -4725,11 +5129,11 @@
       <w:tr>
         <w:tc>
           <w:tcPr>
-            <w:tcW w:type="dxa" w:w="6236"/>
+            <w:tcW w:type="dxa" w:w="5386"/>
           </w:tcPr>
           <w:p>
             <w:pPr>
-              <w:spacing w:before="20" w:after="20"/>
+              <w:spacing w:before="40" w:after="40" w:line="276" w:lineRule="auto"/>
               <w:ind w:left="283"/>
             </w:pPr>
             <w:r>
@@ -4752,24 +5156,29 @@
         </w:tc>
         <w:tc>
           <w:tcPr>
-            <w:tcW w:type="dxa" w:w="2835"/>
-            <w:tcBorders>
-              <w:top w:val="nil"/>
-              <w:left w:val="nil"/>
-              <w:right w:val="nil"/>
-              <w:bottom w:val="dotted" w:sz="12" w:space="1" w:color="000000"/>
-            </w:tcBorders>
+            <w:tcW w:type="dxa" w:w="3118"/>
           </w:tcPr>
           <w:p>
-            <w:r/>
+            <w:pPr>
+              <w:spacing w:before="40" w:after="40"/>
+            </w:pPr>
+            <w:r>
+              <w:rPr>
+                <w:rFonts w:ascii="Times New Roman" w:hAnsi="Times New Roman"/>
+                <w:b w:val="0"/>
+                <w:sz w:val="24"/>
+              </w:rPr>
+              <w:t xml:space="preserve">. . . . . . . . . . . . . . . . </w:t>
+            </w:r>
           </w:p>
         </w:tc>
         <w:tc>
           <w:tcPr>
-            <w:tcW w:type="dxa" w:w="907"/>
+            <w:tcW w:type="dxa" w:w="1020"/>
           </w:tcPr>
           <w:p>
             <w:pPr>
+              <w:spacing w:before="40" w:after="40"/>
               <w:jc w:val="right"/>
             </w:pPr>
             <w:r>
@@ -4786,11 +5195,11 @@
       <w:tr>
         <w:tc>
           <w:tcPr>
-            <w:tcW w:type="dxa" w:w="6236"/>
+            <w:tcW w:type="dxa" w:w="5386"/>
           </w:tcPr>
           <w:p>
             <w:pPr>
-              <w:spacing w:before="20" w:after="20"/>
+              <w:spacing w:before="40" w:after="40" w:line="276" w:lineRule="auto"/>
               <w:ind w:left="283"/>
             </w:pPr>
             <w:r>
@@ -4813,24 +5222,29 @@
         </w:tc>
         <w:tc>
           <w:tcPr>
-            <w:tcW w:type="dxa" w:w="2835"/>
-            <w:tcBorders>
-              <w:top w:val="nil"/>
-              <w:left w:val="nil"/>
-              <w:right w:val="nil"/>
-              <w:bottom w:val="dotted" w:sz="12" w:space="1" w:color="000000"/>
-            </w:tcBorders>
+            <w:tcW w:type="dxa" w:w="3118"/>
           </w:tcPr>
           <w:p>
-            <w:r/>
+            <w:pPr>
+              <w:spacing w:before="40" w:after="40"/>
+            </w:pPr>
+            <w:r>
+              <w:rPr>
+                <w:rFonts w:ascii="Times New Roman" w:hAnsi="Times New Roman"/>
+                <w:b w:val="0"/>
+                <w:sz w:val="24"/>
+              </w:rPr>
+              <w:t xml:space="preserve">. . . . . . . . . . . . . . . . </w:t>
+            </w:r>
           </w:p>
         </w:tc>
         <w:tc>
           <w:tcPr>
-            <w:tcW w:type="dxa" w:w="907"/>
+            <w:tcW w:type="dxa" w:w="1020"/>
           </w:tcPr>
           <w:p>
             <w:pPr>
+              <w:spacing w:before="40" w:after="40"/>
               <w:jc w:val="right"/>
             </w:pPr>
             <w:r>
@@ -4847,11 +5261,11 @@
       <w:tr>
         <w:tc>
           <w:tcPr>
-            <w:tcW w:type="dxa" w:w="6236"/>
+            <w:tcW w:type="dxa" w:w="5386"/>
           </w:tcPr>
           <w:p>
             <w:pPr>
-              <w:spacing w:before="20" w:after="20"/>
+              <w:spacing w:before="40" w:after="40" w:line="276" w:lineRule="auto"/>
               <w:ind w:left="283"/>
             </w:pPr>
             <w:r>
@@ -4874,24 +5288,29 @@
         </w:tc>
         <w:tc>
           <w:tcPr>
-            <w:tcW w:type="dxa" w:w="2835"/>
-            <w:tcBorders>
-              <w:top w:val="nil"/>
-              <w:left w:val="nil"/>
-              <w:right w:val="nil"/>
-              <w:bottom w:val="dotted" w:sz="12" w:space="1" w:color="000000"/>
-            </w:tcBorders>
+            <w:tcW w:type="dxa" w:w="3118"/>
           </w:tcPr>
           <w:p>
-            <w:r/>
+            <w:pPr>
+              <w:spacing w:before="40" w:after="40"/>
+            </w:pPr>
+            <w:r>
+              <w:rPr>
+                <w:rFonts w:ascii="Times New Roman" w:hAnsi="Times New Roman"/>
+                <w:b w:val="0"/>
+                <w:sz w:val="24"/>
+              </w:rPr>
+              <w:t xml:space="preserve">. . . . . . . . . . . . . . . . </w:t>
+            </w:r>
           </w:p>
         </w:tc>
         <w:tc>
           <w:tcPr>
-            <w:tcW w:type="dxa" w:w="907"/>
+            <w:tcW w:type="dxa" w:w="1020"/>
           </w:tcPr>
           <w:p>
             <w:pPr>
+              <w:spacing w:before="40" w:after="40"/>
               <w:jc w:val="right"/>
             </w:pPr>
             <w:r>
@@ -4908,11 +5327,11 @@
       <w:tr>
         <w:tc>
           <w:tcPr>
-            <w:tcW w:type="dxa" w:w="6236"/>
+            <w:tcW w:type="dxa" w:w="5386"/>
           </w:tcPr>
           <w:p>
             <w:pPr>
-              <w:spacing w:before="20" w:after="20"/>
+              <w:spacing w:before="40" w:after="40" w:line="276" w:lineRule="auto"/>
               <w:ind w:left="283"/>
             </w:pPr>
             <w:r>
@@ -4935,24 +5354,29 @@
         </w:tc>
         <w:tc>
           <w:tcPr>
-            <w:tcW w:type="dxa" w:w="2835"/>
-            <w:tcBorders>
-              <w:top w:val="nil"/>
-              <w:left w:val="nil"/>
-              <w:right w:val="nil"/>
-              <w:bottom w:val="dotted" w:sz="12" w:space="1" w:color="000000"/>
-            </w:tcBorders>
+            <w:tcW w:type="dxa" w:w="3118"/>
           </w:tcPr>
           <w:p>
-            <w:r/>
+            <w:pPr>
+              <w:spacing w:before="40" w:after="40"/>
+            </w:pPr>
+            <w:r>
+              <w:rPr>
+                <w:rFonts w:ascii="Times New Roman" w:hAnsi="Times New Roman"/>
+                <w:b w:val="0"/>
+                <w:sz w:val="24"/>
+              </w:rPr>
+              <w:t xml:space="preserve">. . . . . . . . . . . . . . . . </w:t>
+            </w:r>
           </w:p>
         </w:tc>
         <w:tc>
           <w:tcPr>
-            <w:tcW w:type="dxa" w:w="907"/>
+            <w:tcW w:type="dxa" w:w="1020"/>
           </w:tcPr>
           <w:p>
             <w:pPr>
+              <w:spacing w:before="40" w:after="40"/>
               <w:jc w:val="right"/>
             </w:pPr>
             <w:r>
@@ -4969,11 +5393,11 @@
       <w:tr>
         <w:tc>
           <w:tcPr>
-            <w:tcW w:type="dxa" w:w="6236"/>
+            <w:tcW w:type="dxa" w:w="5386"/>
           </w:tcPr>
           <w:p>
             <w:pPr>
-              <w:spacing w:before="20" w:after="20"/>
+              <w:spacing w:before="40" w:after="40" w:line="276" w:lineRule="auto"/>
               <w:ind w:left="283"/>
             </w:pPr>
             <w:r>
@@ -4996,24 +5420,29 @@
         </w:tc>
         <w:tc>
           <w:tcPr>
-            <w:tcW w:type="dxa" w:w="2835"/>
-            <w:tcBorders>
-              <w:top w:val="nil"/>
-              <w:left w:val="nil"/>
-              <w:right w:val="nil"/>
-              <w:bottom w:val="dotted" w:sz="12" w:space="1" w:color="000000"/>
-            </w:tcBorders>
+            <w:tcW w:type="dxa" w:w="3118"/>
           </w:tcPr>
           <w:p>
-            <w:r/>
+            <w:pPr>
+              <w:spacing w:before="40" w:after="40"/>
+            </w:pPr>
+            <w:r>
+              <w:rPr>
+                <w:rFonts w:ascii="Times New Roman" w:hAnsi="Times New Roman"/>
+                <w:b w:val="0"/>
+                <w:sz w:val="24"/>
+              </w:rPr>
+              <w:t xml:space="preserve">. . . . . . . . . . . . . . . . </w:t>
+            </w:r>
           </w:p>
         </w:tc>
         <w:tc>
           <w:tcPr>
-            <w:tcW w:type="dxa" w:w="907"/>
+            <w:tcW w:type="dxa" w:w="1020"/>
           </w:tcPr>
           <w:p>
             <w:pPr>
+              <w:spacing w:before="40" w:after="40"/>
               <w:jc w:val="right"/>
             </w:pPr>
             <w:r>
@@ -5030,11 +5459,11 @@
       <w:tr>
         <w:tc>
           <w:tcPr>
-            <w:tcW w:type="dxa" w:w="6236"/>
+            <w:tcW w:type="dxa" w:w="5386"/>
           </w:tcPr>
           <w:p>
             <w:pPr>
-              <w:spacing w:before="20" w:after="20"/>
+              <w:spacing w:before="40" w:after="40" w:line="276" w:lineRule="auto"/>
             </w:pPr>
             <w:r>
               <w:rPr>
@@ -5048,24 +5477,29 @@
         </w:tc>
         <w:tc>
           <w:tcPr>
-            <w:tcW w:type="dxa" w:w="2835"/>
-            <w:tcBorders>
-              <w:top w:val="nil"/>
-              <w:left w:val="nil"/>
-              <w:right w:val="nil"/>
-              <w:bottom w:val="dotted" w:sz="12" w:space="1" w:color="000000"/>
-            </w:tcBorders>
+            <w:tcW w:type="dxa" w:w="3118"/>
           </w:tcPr>
           <w:p>
-            <w:r/>
+            <w:pPr>
+              <w:spacing w:before="40" w:after="40"/>
+            </w:pPr>
+            <w:r>
+              <w:rPr>
+                <w:rFonts w:ascii="Times New Roman" w:hAnsi="Times New Roman"/>
+                <w:b w:val="0"/>
+                <w:sz w:val="24"/>
+              </w:rPr>
+              <w:t xml:space="preserve">. . . . . . . . . . . . . . . . </w:t>
+            </w:r>
           </w:p>
         </w:tc>
         <w:tc>
           <w:tcPr>
-            <w:tcW w:type="dxa" w:w="907"/>
+            <w:tcW w:type="dxa" w:w="1020"/>
           </w:tcPr>
           <w:p>
             <w:pPr>
+              <w:spacing w:before="40" w:after="40"/>
               <w:jc w:val="right"/>
             </w:pPr>
             <w:r>
@@ -5082,11 +5516,11 @@
       <w:tr>
         <w:tc>
           <w:tcPr>
-            <w:tcW w:type="dxa" w:w="6236"/>
+            <w:tcW w:type="dxa" w:w="5386"/>
           </w:tcPr>
           <w:p>
             <w:pPr>
-              <w:spacing w:before="20" w:after="20"/>
+              <w:spacing w:before="40" w:after="40" w:line="276" w:lineRule="auto"/>
             </w:pPr>
             <w:r>
               <w:rPr>
@@ -5100,24 +5534,29 @@
         </w:tc>
         <w:tc>
           <w:tcPr>
-            <w:tcW w:type="dxa" w:w="2835"/>
-            <w:tcBorders>
-              <w:top w:val="nil"/>
-              <w:left w:val="nil"/>
-              <w:right w:val="nil"/>
-              <w:bottom w:val="dotted" w:sz="12" w:space="1" w:color="000000"/>
-            </w:tcBorders>
+            <w:tcW w:type="dxa" w:w="3118"/>
           </w:tcPr>
           <w:p>
-            <w:r/>
+            <w:pPr>
+              <w:spacing w:before="40" w:after="40"/>
+            </w:pPr>
+            <w:r>
+              <w:rPr>
+                <w:rFonts w:ascii="Times New Roman" w:hAnsi="Times New Roman"/>
+                <w:b w:val="0"/>
+                <w:sz w:val="24"/>
+              </w:rPr>
+              <w:t xml:space="preserve">. . . . . . . . . . . . . . . . </w:t>
+            </w:r>
           </w:p>
         </w:tc>
         <w:tc>
           <w:tcPr>
-            <w:tcW w:type="dxa" w:w="907"/>
+            <w:tcW w:type="dxa" w:w="1020"/>
           </w:tcPr>
           <w:p>
             <w:pPr>
+              <w:spacing w:before="40" w:after="40"/>
               <w:jc w:val="right"/>
             </w:pPr>
             <w:r>
@@ -5134,7 +5573,7 @@
     </w:tbl>
     <w:sectPr>
       <w:pgSz w:w="11906" w:h="16838"/>
-      <w:pgMar w:top="907" w:right="1020" w:bottom="907" w:left="1020" w:header="720" w:footer="720" w:gutter="0"/>
+      <w:pgMar w:top="1020" w:right="1134" w:bottom="1020" w:left="1134" w:header="720" w:footer="720" w:gutter="0"/>
       <w:cols w:space="720"/>
       <w:docGrid w:linePitch="360"/>
     </w:sectPr>
@@ -5505,6 +5944,10 @@
     <w:name w:val="Normal"/>
     <w:qFormat/>
     <w:rsid w:val="00FC693F"/>
+    <w:rPr>
+      <w:rFonts w:ascii="Times New Roman" w:hAnsi="Times New Roman"/>
+      <w:sz w:val="24"/>
+    </w:rPr>
   </w:style>
   <w:style w:type="paragraph" w:styleId="Header">
     <w:name w:val="header"/>

</xml_diff>